<commit_message>
Minor correction to sample.
</commit_message>
<xml_diff>
--- a/documentation/ExtendedEthiopicSamples-Ethiop.docx
+++ b/documentation/ExtendedEthiopicSamples-Ethiop.docx
@@ -14259,7 +14259,7 @@
           <w:noProof/>
         </w:rPr>
         <w:pict>
-          <v:rect id="_x0000_i1028" alt="" style="width:314.5pt;height:.05pt;mso-width-percent:0;mso-height-percent:0;mso-width-percent:0;mso-height-percent:0" o:hrpct="672" o:hralign="center" o:hrstd="t" o:hr="t" fillcolor="#9d9da1" stroked="f"/>
+          <v:rect id="_x0000_i1028" alt="" style="width:303.25pt;height:.05pt;mso-width-percent:0;mso-height-percent:0;mso-width-percent:0;mso-height-percent:0" o:hrpct="648" o:hralign="center" o:hrstd="t" o:hr="t" fillcolor="#9d9da1" stroked="f"/>
         </w:pict>
       </w:r>
     </w:p>
@@ -15710,27 +15710,27 @@
           <w:rFonts w:ascii="ethiop" w:hAnsi="ethiop" w:cs="Abyssinica SIL"/>
           <w:vertAlign w:val="superscript"/>
         </w:rPr>
+        <w:t>26</w:t>
+      </w:r>
+      <w:r>
+        <w:rPr>
+          <w:rFonts w:ascii="ethiop" w:hAnsi="ethiop" w:cs="Abyssinica SIL"/>
+        </w:rPr>
+        <w:t>ኤስን ካሢ ኬስን አሢ ሀይቁⶥዎጥናን ቃይጻም</w:t>
+      </w:r>
+    </w:p>
+    <w:p>
+      <w:pPr>
+        <w:pStyle w:val="HTMLPreformatted"/>
+        <w:rPr>
+          <w:rFonts w:ascii="ethiop" w:hAnsi="ethiop" w:cs="Abyssinica SIL"/>
+        </w:rPr>
+      </w:pPr>
+      <w:r>
+        <w:rPr>
+          <w:rFonts w:ascii="ethiop" w:hAnsi="ethiop" w:cs="Abyssinica SIL"/>
+        </w:rPr>
         <w:lastRenderedPageBreak/>
-        <w:t>26</w:t>
-      </w:r>
-      <w:r>
-        <w:rPr>
-          <w:rFonts w:ascii="ethiop" w:hAnsi="ethiop" w:cs="Abyssinica SIL"/>
-        </w:rPr>
-        <w:t>ኤስን ካሢ ኬስን አሢ ሀይቁⶥዎጥናን ቃይጻም</w:t>
-      </w:r>
-    </w:p>
-    <w:p>
-      <w:pPr>
-        <w:pStyle w:val="HTMLPreformatted"/>
-        <w:rPr>
-          <w:rFonts w:ascii="ethiop" w:hAnsi="ethiop" w:cs="Abyssinica SIL"/>
-        </w:rPr>
-      </w:pPr>
-      <w:r>
-        <w:rPr>
-          <w:rFonts w:ascii="ethiop" w:hAnsi="ethiop" w:cs="Abyssinica SIL"/>
-        </w:rPr>
         <w:t>ቤስታርጉⶥ ጊባቲንድ ሀይቅንቂ ይስኩዌ።</w:t>
       </w:r>
     </w:p>
@@ -15746,7 +15746,7 @@
           <w:noProof/>
         </w:rPr>
         <w:pict>
-          <v:rect id="_x0000_i1027" alt="" style="width:314.5pt;height:.05pt;mso-width-percent:0;mso-height-percent:0;mso-width-percent:0;mso-height-percent:0" o:hrpct="672" o:hralign="center" o:hrstd="t" o:hr="t" fillcolor="#9d9da1" stroked="f"/>
+          <v:rect id="_x0000_i1027" alt="" style="width:303.25pt;height:.05pt;mso-width-percent:0;mso-height-percent:0;mso-width-percent:0;mso-height-percent:0" o:hrpct="648" o:hralign="center" o:hrstd="t" o:hr="t" fillcolor="#9d9da1" stroked="f"/>
         </w:pict>
       </w:r>
     </w:p>
@@ -16683,48 +16683,48 @@
         <w:rPr>
           <w:rFonts w:ascii="ethiop" w:hAnsi="ethiop" w:cs="Abyssinica SIL"/>
         </w:rPr>
+        <w:t xml:space="preserve">ጊዜዎ፡፤ </w:t>
+      </w:r>
+      <w:r>
+        <w:rPr>
+          <w:rFonts w:ascii="ethiop" w:hAnsi="ethiop" w:cs="Abyssinica SIL"/>
+          <w:vertAlign w:val="superscript"/>
+        </w:rPr>
+        <w:t>18</w:t>
+      </w:r>
+      <w:r>
+        <w:rPr>
+          <w:rFonts w:ascii="ethiop" w:hAnsi="ethiop" w:cs="Abyssinica SIL"/>
+        </w:rPr>
+        <w:t>ዲግ ኮዪ ይስኬንድ አሥንዲንድ ዲጊስ</w:t>
+      </w:r>
+    </w:p>
+    <w:p>
+      <w:pPr>
+        <w:pStyle w:val="HTMLPreformatted"/>
+        <w:rPr>
+          <w:rFonts w:ascii="ethiop" w:hAnsi="ethiop" w:cs="Abyssinica SIL"/>
+        </w:rPr>
+      </w:pPr>
+      <w:r>
+        <w:rPr>
+          <w:rFonts w:ascii="ethiop" w:hAnsi="ethiop" w:cs="Abyssinica SIL"/>
+        </w:rPr>
+        <w:t>ቃይጽንሲ ⶦዳስ አሥንዲስ ዬር አፕም ሶይናስ</w:t>
+      </w:r>
+    </w:p>
+    <w:p>
+      <w:pPr>
+        <w:pStyle w:val="HTMLPreformatted"/>
+        <w:rPr>
+          <w:rFonts w:ascii="ethiop" w:hAnsi="ethiop" w:cs="Abyssinica SIL"/>
+        </w:rPr>
+      </w:pPr>
+      <w:r>
+        <w:rPr>
+          <w:rFonts w:ascii="ethiop" w:hAnsi="ethiop" w:cs="Abyssinica SIL"/>
+        </w:rPr>
         <w:lastRenderedPageBreak/>
-        <w:t xml:space="preserve">ጊዜዎ፡፤ </w:t>
-      </w:r>
-      <w:r>
-        <w:rPr>
-          <w:rFonts w:ascii="ethiop" w:hAnsi="ethiop" w:cs="Abyssinica SIL"/>
-          <w:vertAlign w:val="superscript"/>
-        </w:rPr>
-        <w:t>18</w:t>
-      </w:r>
-      <w:r>
-        <w:rPr>
-          <w:rFonts w:ascii="ethiop" w:hAnsi="ethiop" w:cs="Abyssinica SIL"/>
-        </w:rPr>
-        <w:t>ዲግ ኮዪ ይስኬንድ አሥንዲንድ ዲጊስ</w:t>
-      </w:r>
-    </w:p>
-    <w:p>
-      <w:pPr>
-        <w:pStyle w:val="HTMLPreformatted"/>
-        <w:rPr>
-          <w:rFonts w:ascii="ethiop" w:hAnsi="ethiop" w:cs="Abyssinica SIL"/>
-        </w:rPr>
-      </w:pPr>
-      <w:r>
-        <w:rPr>
-          <w:rFonts w:ascii="ethiop" w:hAnsi="ethiop" w:cs="Abyssinica SIL"/>
-        </w:rPr>
-        <w:t>ቃይጽንሲ ⶦዳስ አሥንዲስ ዬር አፕም ሶይናስ</w:t>
-      </w:r>
-    </w:p>
-    <w:p>
-      <w:pPr>
-        <w:pStyle w:val="HTMLPreformatted"/>
-        <w:rPr>
-          <w:rFonts w:ascii="ethiop" w:hAnsi="ethiop" w:cs="Abyssinica SIL"/>
-        </w:rPr>
-      </w:pPr>
-      <w:r>
-        <w:rPr>
-          <w:rFonts w:ascii="ethiop" w:hAnsi="ethiop" w:cs="Abyssinica SIL"/>
-        </w:rPr>
         <w:t>አሥንሴንዴ።</w:t>
       </w:r>
     </w:p>
@@ -16740,7 +16740,7 @@
           <w:noProof/>
         </w:rPr>
         <w:pict>
-          <v:rect id="_x0000_i1026" alt="" style="width:314.5pt;height:.05pt;mso-width-percent:0;mso-height-percent:0;mso-width-percent:0;mso-height-percent:0" o:hrpct="672" o:hralign="center" o:hrstd="t" o:hr="t" fillcolor="#9d9da1" stroked="f"/>
+          <v:rect id="_x0000_i1026" alt="" style="width:303.25pt;height:.05pt;mso-width-percent:0;mso-height-percent:0;mso-width-percent:0;mso-height-percent:0" o:hrpct="648" o:hralign="center" o:hrstd="t" o:hr="t" fillcolor="#9d9da1" stroked="f"/>
         </w:pict>
       </w:r>
     </w:p>
@@ -17678,97 +17678,97 @@
         <w:rPr>
           <w:rFonts w:ascii="ethiop" w:hAnsi="ethiop" w:cs="Abyssinica SIL"/>
         </w:rPr>
+        <w:t>ሀንጉⶣ ኑ ቃይጽንሱዌ</w:t>
+      </w:r>
+      <w:r>
+        <w:rPr>
+          <w:rFonts w:ascii="Cambria" w:hAnsi="Cambria" w:cs="Cambria"/>
+        </w:rPr>
+        <w:t>·</w:t>
+      </w:r>
+      <w:r>
+        <w:rPr>
+          <w:rFonts w:ascii="ethiop" w:hAnsi="ethiop" w:cs="Abyssinica SIL"/>
+        </w:rPr>
+        <w:t xml:space="preserve"> ማኪ ይስኩⶣ ጊዜዎ። </w:t>
+      </w:r>
+      <w:r>
+        <w:rPr>
+          <w:rFonts w:ascii="ethiop" w:hAnsi="ethiop" w:cs="Abyssinica SIL"/>
+          <w:vertAlign w:val="superscript"/>
+        </w:rPr>
+        <w:t>16</w:t>
+      </w:r>
+      <w:r>
+        <w:rPr>
+          <w:rFonts w:ascii="ethiop" w:hAnsi="ethiop" w:cs="Abyssinica SIL"/>
+        </w:rPr>
+        <w:t>ሀⶥ</w:t>
+      </w:r>
+    </w:p>
+    <w:p>
+      <w:pPr>
+        <w:pStyle w:val="HTMLPreformatted"/>
+        <w:rPr>
+          <w:rFonts w:ascii="ethiop" w:hAnsi="ethiop" w:cs="Abyssinica SIL"/>
+        </w:rPr>
+      </w:pPr>
+      <w:r>
+        <w:rPr>
+          <w:rFonts w:ascii="ethiop" w:hAnsi="ethiop" w:cs="Abyssinica SIL"/>
+        </w:rPr>
+        <w:t>ኤስን ይንቲ ቃይጽንሱ ቃይጼሽን ኤርቲ ይንቲ ጋሂ</w:t>
+      </w:r>
+    </w:p>
+    <w:p>
+      <w:pPr>
+        <w:pStyle w:val="HTMLPreformatted"/>
+        <w:rPr>
+          <w:rFonts w:ascii="ethiop" w:hAnsi="ethiop" w:cs="Abyssinica SIL"/>
+        </w:rPr>
+      </w:pPr>
+      <w:r>
+        <w:rPr>
+          <w:rFonts w:ascii="ethiop" w:hAnsi="ethiop" w:cs="Abyssinica SIL"/>
+        </w:rPr>
         <w:lastRenderedPageBreak/>
-        <w:t>ሀንጉⶣ ኑ ቃይጽንሱዌ</w:t>
-      </w:r>
-      <w:r>
-        <w:rPr>
-          <w:rFonts w:ascii="Cambria" w:hAnsi="Cambria" w:cs="Cambria"/>
-        </w:rPr>
-        <w:t>·</w:t>
-      </w:r>
-      <w:r>
-        <w:rPr>
-          <w:rFonts w:ascii="ethiop" w:hAnsi="ethiop" w:cs="Abyssinica SIL"/>
-        </w:rPr>
-        <w:t xml:space="preserve"> ማኪ ይስኩⶣ ጊዜዎ። </w:t>
-      </w:r>
+        <w:t>ይስኩዌ። ኡⶥዎጥን አሢ ኤርቲ ይስኩⶢ ካንግ ኢታ</w:t>
+      </w:r>
+    </w:p>
+    <w:p>
+      <w:pPr>
+        <w:pStyle w:val="HTMLPreformatted"/>
+        <w:rPr>
+          <w:rFonts w:ascii="ethiop" w:hAnsi="ethiop" w:cs="Abyssinica SIL"/>
+        </w:rPr>
+      </w:pPr>
+      <w:r>
+        <w:rPr>
+          <w:rFonts w:ascii="ethiop" w:hAnsi="ethiop" w:cs="Abyssinica SIL"/>
+        </w:rPr>
+        <w:t>ጊዜዎ።</w:t>
+      </w:r>
+    </w:p>
+    <w:p>
+      <w:pPr>
+        <w:pStyle w:val="HTMLPreformatted"/>
+        <w:rPr>
+          <w:rFonts w:ascii="ethiop" w:hAnsi="ethiop" w:cs="Abyssinica SIL"/>
+        </w:rPr>
+      </w:pPr>
+    </w:p>
+    <w:p>
+      <w:pPr>
+        <w:pStyle w:val="HTMLPreformatted"/>
+        <w:rPr>
+          <w:rFonts w:ascii="ethiop" w:hAnsi="ethiop" w:cs="Abyssinica SIL"/>
+        </w:rPr>
+      </w:pPr>
       <w:r>
         <w:rPr>
           <w:rFonts w:ascii="ethiop" w:hAnsi="ethiop" w:cs="Abyssinica SIL"/>
           <w:vertAlign w:val="superscript"/>
         </w:rPr>
-        <w:t>16</w:t>
-      </w:r>
-      <w:r>
-        <w:rPr>
-          <w:rFonts w:ascii="ethiop" w:hAnsi="ethiop" w:cs="Abyssinica SIL"/>
-        </w:rPr>
-        <w:t>ሀⶥ</w:t>
-      </w:r>
-    </w:p>
-    <w:p>
-      <w:pPr>
-        <w:pStyle w:val="HTMLPreformatted"/>
-        <w:rPr>
-          <w:rFonts w:ascii="ethiop" w:hAnsi="ethiop" w:cs="Abyssinica SIL"/>
-        </w:rPr>
-      </w:pPr>
-      <w:r>
-        <w:rPr>
-          <w:rFonts w:ascii="ethiop" w:hAnsi="ethiop" w:cs="Abyssinica SIL"/>
-        </w:rPr>
-        <w:t>ኤስን ይንቲ ቃይጽንሱ ቃይጼሽን ኤርቲ ይንቲ ጋሂ</w:t>
-      </w:r>
-    </w:p>
-    <w:p>
-      <w:pPr>
-        <w:pStyle w:val="HTMLPreformatted"/>
-        <w:rPr>
-          <w:rFonts w:ascii="ethiop" w:hAnsi="ethiop" w:cs="Abyssinica SIL"/>
-        </w:rPr>
-      </w:pPr>
-      <w:r>
-        <w:rPr>
-          <w:rFonts w:ascii="ethiop" w:hAnsi="ethiop" w:cs="Abyssinica SIL"/>
-        </w:rPr>
-        <w:t>ይስኩዌ። ኡⶥዎጥን አሢ ኤርቲ ይስኩⶢ ካንግ ኢታ</w:t>
-      </w:r>
-    </w:p>
-    <w:p>
-      <w:pPr>
-        <w:pStyle w:val="HTMLPreformatted"/>
-        <w:rPr>
-          <w:rFonts w:ascii="ethiop" w:hAnsi="ethiop" w:cs="Abyssinica SIL"/>
-        </w:rPr>
-      </w:pPr>
-      <w:r>
-        <w:rPr>
-          <w:rFonts w:ascii="ethiop" w:hAnsi="ethiop" w:cs="Abyssinica SIL"/>
-        </w:rPr>
-        <w:t>ጊዜዎ።</w:t>
-      </w:r>
-    </w:p>
-    <w:p>
-      <w:pPr>
-        <w:pStyle w:val="HTMLPreformatted"/>
-        <w:rPr>
-          <w:rFonts w:ascii="ethiop" w:hAnsi="ethiop" w:cs="Abyssinica SIL"/>
-        </w:rPr>
-      </w:pPr>
-    </w:p>
-    <w:p>
-      <w:pPr>
-        <w:pStyle w:val="HTMLPreformatted"/>
-        <w:rPr>
-          <w:rFonts w:ascii="ethiop" w:hAnsi="ethiop" w:cs="Abyssinica SIL"/>
-        </w:rPr>
-      </w:pPr>
-      <w:r>
-        <w:rPr>
-          <w:rFonts w:ascii="ethiop" w:hAnsi="ethiop" w:cs="Abyssinica SIL"/>
-          <w:vertAlign w:val="superscript"/>
-        </w:rPr>
         <w:t>17</w:t>
       </w:r>
       <w:r>
@@ -17804,7 +17804,7 @@
           <w:noProof/>
         </w:rPr>
         <w:pict>
-          <v:rect id="_x0000_i1025" alt="" style="width:314.5pt;height:.05pt;mso-width-percent:0;mso-height-percent:0;mso-width-percent:0;mso-height-percent:0" o:hrpct="672" o:hralign="center" o:hrstd="t" o:hr="t" fillcolor="#9d9da1" stroked="f"/>
+          <v:rect id="_x0000_i1025" alt="" style="width:303.25pt;height:.05pt;mso-width-percent:0;mso-height-percent:0;mso-width-percent:0;mso-height-percent:0" o:hrpct="648" o:hralign="center" o:hrstd="t" o:hr="t" fillcolor="#9d9da1" stroked="f"/>
         </w:pict>
       </w:r>
     </w:p>
@@ -18665,68 +18665,68 @@
           <w:rFonts w:ascii="ethiop" w:hAnsi="ethiop" w:cs="Abyssinica SIL"/>
           <w:vertAlign w:val="superscript"/>
         </w:rPr>
+        <w:t>13</w:t>
+      </w:r>
+      <w:r>
+        <w:rPr>
+          <w:rFonts w:ascii="ethiop" w:hAnsi="ethiop" w:cs="Abyssinica SIL"/>
+        </w:rPr>
+        <w:t>ይንታይቅን ጾጽቃኒንድ ኢራቲ ይ ዴብም አቱⶥ</w:t>
+      </w:r>
+    </w:p>
+    <w:p>
+      <w:pPr>
+        <w:pStyle w:val="HTMLPreformatted"/>
+        <w:rPr>
+          <w:rFonts w:ascii="ethiop" w:hAnsi="ethiop" w:cs="Abyssinica SIL"/>
+        </w:rPr>
+      </w:pPr>
+      <w:r>
+        <w:rPr>
+          <w:rFonts w:ascii="ethiop" w:hAnsi="ethiop" w:cs="Abyssinica SIL"/>
+        </w:rPr>
+        <w:t xml:space="preserve">አሢ ባ ይስታን ጾክማኬ። ካሲ ካዥቂ ይስኩⶢንድ ባ </w:t>
+      </w:r>
+    </w:p>
+    <w:p>
+      <w:pPr>
+        <w:pStyle w:val="HTMLPreformatted"/>
+        <w:rPr>
+          <w:rFonts w:ascii="ethiop" w:hAnsi="ethiop" w:cs="Abyssinica SIL"/>
+        </w:rPr>
+      </w:pPr>
+      <w:r>
+        <w:rPr>
+          <w:rFonts w:ascii="ethiop" w:hAnsi="ethiop" w:cs="Abyssinica SIL"/>
+        </w:rPr>
+        <w:t xml:space="preserve">ይስታን ዬሪስ ጋላትኒ ሻልማኬ። </w:t>
+      </w:r>
+      <w:r>
+        <w:rPr>
+          <w:rFonts w:ascii="ethiop" w:hAnsi="ethiop" w:cs="Abyssinica SIL"/>
+          <w:vertAlign w:val="superscript"/>
+        </w:rPr>
+        <w:t>14</w:t>
+      </w:r>
+      <w:r>
+        <w:rPr>
+          <w:rFonts w:ascii="ethiop" w:hAnsi="ethiop" w:cs="Abyssinica SIL"/>
+        </w:rPr>
+        <w:t>አሣ ፑርስቲ</w:t>
+      </w:r>
+    </w:p>
+    <w:p>
+      <w:pPr>
+        <w:pStyle w:val="HTMLPreformatted"/>
+        <w:rPr>
+          <w:rFonts w:ascii="ethiop" w:hAnsi="ethiop" w:cs="Abyssinica SIL"/>
+        </w:rPr>
+      </w:pPr>
+      <w:r>
+        <w:rPr>
+          <w:rFonts w:ascii="ethiop" w:hAnsi="ethiop" w:cs="Abyssinica SIL"/>
+        </w:rPr>
         <w:lastRenderedPageBreak/>
-        <w:t>13</w:t>
-      </w:r>
-      <w:r>
-        <w:rPr>
-          <w:rFonts w:ascii="ethiop" w:hAnsi="ethiop" w:cs="Abyssinica SIL"/>
-        </w:rPr>
-        <w:t>ይንታይቅን ጾጽቃኒንድ ኢራቲ ይ ዴብም አቱⶥ</w:t>
-      </w:r>
-    </w:p>
-    <w:p>
-      <w:pPr>
-        <w:pStyle w:val="HTMLPreformatted"/>
-        <w:rPr>
-          <w:rFonts w:ascii="ethiop" w:hAnsi="ethiop" w:cs="Abyssinica SIL"/>
-        </w:rPr>
-      </w:pPr>
-      <w:r>
-        <w:rPr>
-          <w:rFonts w:ascii="ethiop" w:hAnsi="ethiop" w:cs="Abyssinica SIL"/>
-        </w:rPr>
-        <w:t xml:space="preserve">አሢ ባ ይስታን ጾክማኬ። ካሲ ካዥቂ ይስኩⶢንድ ባ </w:t>
-      </w:r>
-    </w:p>
-    <w:p>
-      <w:pPr>
-        <w:pStyle w:val="HTMLPreformatted"/>
-        <w:rPr>
-          <w:rFonts w:ascii="ethiop" w:hAnsi="ethiop" w:cs="Abyssinica SIL"/>
-        </w:rPr>
-      </w:pPr>
-      <w:r>
-        <w:rPr>
-          <w:rFonts w:ascii="ethiop" w:hAnsi="ethiop" w:cs="Abyssinica SIL"/>
-        </w:rPr>
-        <w:t xml:space="preserve">ይስታን ዬሪስ ጋላትኒ ሻልማኬ። </w:t>
-      </w:r>
-      <w:r>
-        <w:rPr>
-          <w:rFonts w:ascii="ethiop" w:hAnsi="ethiop" w:cs="Abyssinica SIL"/>
-          <w:vertAlign w:val="superscript"/>
-        </w:rPr>
-        <w:t>14</w:t>
-      </w:r>
-      <w:r>
-        <w:rPr>
-          <w:rFonts w:ascii="ethiop" w:hAnsi="ethiop" w:cs="Abyssinica SIL"/>
-        </w:rPr>
-        <w:t>አሣ ፑርስቲ</w:t>
-      </w:r>
-    </w:p>
-    <w:p>
-      <w:pPr>
-        <w:pStyle w:val="HTMLPreformatted"/>
-        <w:rPr>
-          <w:rFonts w:ascii="ethiop" w:hAnsi="ethiop" w:cs="Abyssinica SIL"/>
-        </w:rPr>
-      </w:pPr>
-      <w:r>
-        <w:rPr>
-          <w:rFonts w:ascii="ethiop" w:hAnsi="ethiop" w:cs="Abyssinica SIL"/>
-        </w:rPr>
         <w:t>ይስኩⶢንድ ይንታይቅን ጾጽቃን ባ ይስታን ኪርስቲያንንድ</w:t>
       </w:r>
     </w:p>
@@ -19930,21 +19930,21 @@
         <w:rPr>
           <w:rFonts w:ascii="ethiop" w:hAnsi="ethiop" w:cs="Abyssinica SIL"/>
         </w:rPr>
+        <w:t>በኽ የቸነ ᎃጥጥነትም ᎇሼነት ያኖ ዘንጋ እንም</w:t>
+      </w:r>
+    </w:p>
+    <w:p>
+      <w:pPr>
+        <w:pStyle w:val="HTMLPreformatted"/>
+        <w:rPr>
+          <w:rFonts w:ascii="ethiop" w:hAnsi="ethiop" w:cs="Abyssinica SIL"/>
+        </w:rPr>
+      </w:pPr>
+      <w:r>
+        <w:rPr>
+          <w:rFonts w:ascii="ethiop" w:hAnsi="ethiop" w:cs="Abyssinica SIL"/>
+        </w:rPr>
         <w:lastRenderedPageBreak/>
-        <w:t>በኽ የቸነ ᎃጥጥነትም ᎇሼነት ያኖ ዘንጋ እንም</w:t>
-      </w:r>
-    </w:p>
-    <w:p>
-      <w:pPr>
-        <w:pStyle w:val="HTMLPreformatted"/>
-        <w:rPr>
-          <w:rFonts w:ascii="ethiop" w:hAnsi="ethiop" w:cs="Abyssinica SIL"/>
-        </w:rPr>
-      </w:pPr>
-      <w:r>
-        <w:rPr>
-          <w:rFonts w:ascii="ethiop" w:hAnsi="ethiop" w:cs="Abyssinica SIL"/>
-        </w:rPr>
         <w:t>አውጦም ጔታ በ</w:t>
       </w:r>
       <w:r>
@@ -20896,35 +20896,35 @@
         <w:rPr>
           <w:rFonts w:ascii="ethiop" w:hAnsi="ethiop" w:cs="Abyssinica SIL"/>
         </w:rPr>
+        <w:t>ያተርᎈኔ ይዀላዌ? 15. ዩማካታ ይትኸተረዊም</w:t>
+      </w:r>
+    </w:p>
+    <w:p>
+      <w:pPr>
+        <w:pStyle w:val="HTMLPreformatted"/>
+        <w:rPr>
+          <w:rFonts w:ascii="ethiop" w:hAnsi="ethiop" w:cs="Abyssinica SIL"/>
+        </w:rPr>
+      </w:pPr>
+      <w:r>
+        <w:rPr>
+          <w:rFonts w:ascii="ethiop" w:hAnsi="ethiop" w:cs="Abyssinica SIL"/>
+        </w:rPr>
+        <w:t>ይበረዊ የበከሮ ጐፔ ዌም ኧተᎃ ቢረብሮ 16. ያገነኖ</w:t>
+      </w:r>
+    </w:p>
+    <w:p>
+      <w:pPr>
+        <w:pStyle w:val="HTMLPreformatted"/>
+        <w:rPr>
+          <w:rFonts w:ascii="ethiop" w:hAnsi="ethiop" w:cs="Abyssinica SIL"/>
+        </w:rPr>
+      </w:pPr>
+      <w:r>
+        <w:rPr>
+          <w:rFonts w:ascii="ethiop" w:hAnsi="ethiop" w:cs="Abyssinica SIL"/>
+        </w:rPr>
         <w:lastRenderedPageBreak/>
-        <w:t>ያተርᎈኔ ይዀላዌ? 15. ዩማካታ ይትኸተረዊም</w:t>
-      </w:r>
-    </w:p>
-    <w:p>
-      <w:pPr>
-        <w:pStyle w:val="HTMLPreformatted"/>
-        <w:rPr>
-          <w:rFonts w:ascii="ethiop" w:hAnsi="ethiop" w:cs="Abyssinica SIL"/>
-        </w:rPr>
-      </w:pPr>
-      <w:r>
-        <w:rPr>
-          <w:rFonts w:ascii="ethiop" w:hAnsi="ethiop" w:cs="Abyssinica SIL"/>
-        </w:rPr>
-        <w:t>ይበረዊ የበከሮ ጐፔ ዌም ኧተᎃ ቢረብሮ 16. ያገነኖ</w:t>
-      </w:r>
-    </w:p>
-    <w:p>
-      <w:pPr>
-        <w:pStyle w:val="HTMLPreformatted"/>
-        <w:rPr>
-          <w:rFonts w:ascii="ethiop" w:hAnsi="ethiop" w:cs="Abyssinica SIL"/>
-        </w:rPr>
-      </w:pPr>
-      <w:r>
-        <w:rPr>
-          <w:rFonts w:ascii="ethiop" w:hAnsi="ethiop" w:cs="Abyssinica SIL"/>
-        </w:rPr>
         <w:t xml:space="preserve">ቃር ታቲቦዩ </w:t>
       </w:r>
       <w:r>
@@ -21802,7 +21802,6 @@
         <w:rPr>
           <w:rFonts w:ascii="ethiop" w:hAnsi="ethiop" w:cs="Abyssinica SIL"/>
         </w:rPr>
-        <w:lastRenderedPageBreak/>
         <w:t xml:space="preserve">ዌሽ ጓረባ የሸብራ ᎇስር ያፌዬ ይዀለዌ? የኽክም </w:t>
       </w:r>
     </w:p>
@@ -21851,6 +21850,7 @@
           <w:rFonts w:ascii="ethiop" w:hAnsi="ethiop" w:cs="Abyssinica SIL"/>
           <w:u w:val="thick"/>
         </w:rPr>
+        <w:lastRenderedPageBreak/>
         <w:t>የጔታ ኻሪነት ተኸተር</w:t>
       </w:r>
     </w:p>
@@ -22800,6 +22800,7 @@
         <w:rPr>
           <w:rFonts w:ascii="ethiop" w:hAnsi="ethiop" w:cs="Abyssinica SIL"/>
         </w:rPr>
+        <w:lastRenderedPageBreak/>
         <w:t xml:space="preserve">13. </w:t>
       </w:r>
       <w:r>
@@ -23671,75 +23672,75 @@
         <w:rPr>
           <w:rFonts w:ascii="ethiop" w:hAnsi="ethiop" w:cs="Abyssinica SIL"/>
         </w:rPr>
+        <w:t>የድረስ። 14. ታኹ ግብት የᎀᎀን ሰብ ቢረብር</w:t>
+      </w:r>
+    </w:p>
+    <w:p>
+      <w:pPr>
+        <w:pStyle w:val="HTMLPreformatted"/>
+        <w:rPr>
+          <w:rFonts w:ascii="ethiop" w:hAnsi="ethiop" w:cs="Abyssinica SIL"/>
+        </w:rPr>
+      </w:pPr>
+      <w:r>
+        <w:rPr>
+          <w:rFonts w:ascii="ethiop" w:hAnsi="ethiop" w:cs="Abyssinica SIL"/>
+        </w:rPr>
+        <w:t>የባተስ᎓ን ባሪቅ የዅትኼ የጥራ። ኽኖም በ</w:t>
+      </w:r>
+      <w:r>
+        <w:rPr>
+          <w:rFonts w:ascii="ethiop" w:eastAsia="SunDotum" w:hAnsi="ethiop" w:cs="Abyssinica SIL"/>
+        </w:rPr>
+        <w:t>ⷘታ</w:t>
+      </w:r>
+      <w:r>
+        <w:rPr>
+          <w:rFonts w:ascii="ethiop" w:hAnsi="ethiop" w:cs="Abyssinica SIL"/>
+        </w:rPr>
+        <w:t xml:space="preserve"> ሽም</w:t>
+      </w:r>
+    </w:p>
+    <w:p>
+      <w:pPr>
+        <w:pStyle w:val="HTMLPreformatted"/>
+        <w:rPr>
+          <w:rFonts w:ascii="ethiop" w:hAnsi="ethiop" w:cs="Abyssinica SIL"/>
+        </w:rPr>
+      </w:pPr>
+      <w:r>
+        <w:rPr>
+          <w:rFonts w:ascii="ethiop" w:hAnsi="ethiop" w:cs="Abyssinica SIL"/>
+        </w:rPr>
+        <w:t>ቅባት የቅቦም የጔታ የጠቍሶነ። 15. የዝካ በጔታ</w:t>
+      </w:r>
+    </w:p>
+    <w:p>
+      <w:pPr>
+        <w:pStyle w:val="HTMLPreformatted"/>
+        <w:rPr>
+          <w:rFonts w:ascii="ethiop" w:hAnsi="ethiop" w:cs="Abyssinica SIL"/>
+        </w:rPr>
+      </w:pPr>
+      <w:r>
+        <w:rPr>
+          <w:rFonts w:ascii="ethiop" w:hAnsi="ethiop" w:cs="Abyssinica SIL"/>
+        </w:rPr>
+        <w:t>ተᎀᎀርም ይጨቍሺ ጠሎት የᎀᎀን ያተርፍ፤</w:t>
+      </w:r>
+    </w:p>
+    <w:p>
+      <w:pPr>
+        <w:pStyle w:val="HTMLPreformatted"/>
+        <w:rPr>
+          <w:rFonts w:ascii="ethiop" w:hAnsi="ethiop" w:cs="Abyssinica SIL"/>
+        </w:rPr>
+      </w:pPr>
+      <w:r>
+        <w:rPr>
+          <w:rFonts w:ascii="ethiop" w:eastAsia="SunDotum" w:hAnsi="ethiop" w:cs="Abyssinica SIL"/>
+        </w:rPr>
         <w:lastRenderedPageBreak/>
-        <w:t>የድረስ። 14. ታኹ ግብት የᎀᎀን ሰብ ቢረብር</w:t>
-      </w:r>
-    </w:p>
-    <w:p>
-      <w:pPr>
-        <w:pStyle w:val="HTMLPreformatted"/>
-        <w:rPr>
-          <w:rFonts w:ascii="ethiop" w:hAnsi="ethiop" w:cs="Abyssinica SIL"/>
-        </w:rPr>
-      </w:pPr>
-      <w:r>
-        <w:rPr>
-          <w:rFonts w:ascii="ethiop" w:hAnsi="ethiop" w:cs="Abyssinica SIL"/>
-        </w:rPr>
-        <w:t>የባተስ᎓ን ባሪቅ የዅትኼ የጥራ። ኽኖም በ</w:t>
-      </w:r>
-      <w:r>
-        <w:rPr>
-          <w:rFonts w:ascii="ethiop" w:eastAsia="SunDotum" w:hAnsi="ethiop" w:cs="Abyssinica SIL"/>
-        </w:rPr>
-        <w:t>ⷘታ</w:t>
-      </w:r>
-      <w:r>
-        <w:rPr>
-          <w:rFonts w:ascii="ethiop" w:hAnsi="ethiop" w:cs="Abyssinica SIL"/>
-        </w:rPr>
-        <w:t xml:space="preserve"> ሽም</w:t>
-      </w:r>
-    </w:p>
-    <w:p>
-      <w:pPr>
-        <w:pStyle w:val="HTMLPreformatted"/>
-        <w:rPr>
-          <w:rFonts w:ascii="ethiop" w:hAnsi="ethiop" w:cs="Abyssinica SIL"/>
-        </w:rPr>
-      </w:pPr>
-      <w:r>
-        <w:rPr>
-          <w:rFonts w:ascii="ethiop" w:hAnsi="ethiop" w:cs="Abyssinica SIL"/>
-        </w:rPr>
-        <w:t>ቅባት የቅቦም የጔታ የጠቍሶነ። 15. የዝካ በጔታ</w:t>
-      </w:r>
-    </w:p>
-    <w:p>
-      <w:pPr>
-        <w:pStyle w:val="HTMLPreformatted"/>
-        <w:rPr>
-          <w:rFonts w:ascii="ethiop" w:hAnsi="ethiop" w:cs="Abyssinica SIL"/>
-        </w:rPr>
-      </w:pPr>
-      <w:r>
-        <w:rPr>
-          <w:rFonts w:ascii="ethiop" w:hAnsi="ethiop" w:cs="Abyssinica SIL"/>
-        </w:rPr>
-        <w:t>ተᎀᎀርም ይጨቍሺ ጠሎት የᎀᎀን ያተርፍ፤</w:t>
-      </w:r>
-    </w:p>
-    <w:p>
-      <w:pPr>
-        <w:pStyle w:val="HTMLPreformatted"/>
-        <w:rPr>
-          <w:rFonts w:ascii="ethiop" w:hAnsi="ethiop" w:cs="Abyssinica SIL"/>
-        </w:rPr>
-      </w:pPr>
-      <w:r>
-        <w:rPr>
-          <w:rFonts w:ascii="ethiop" w:eastAsia="SunDotum" w:hAnsi="ethiop" w:cs="Abyssinica SIL"/>
-        </w:rPr>
         <w:t>ⷘታም</w:t>
       </w:r>
       <w:r>
@@ -25277,19 +25278,7 @@
         <w:rPr>
           <w:rFonts w:ascii="ethiop" w:hAnsi="ethiop" w:cs="Abyssinica SIL"/>
         </w:rPr>
-        <w:t xml:space="preserve"> የባሔ፣ እያ ጭን በደᎄ ዘንጌ የትፍራነቁፖ ዘንጋ ነሳሑም ኣድግ ባነ</w:t>
-      </w:r>
-      <w:r>
-        <w:rPr>
-          <w:rFonts w:ascii="Cambria" w:hAnsi="Cambria" w:cs="Cambria"/>
-        </w:rPr>
-        <w:t>»</w:t>
-      </w:r>
-      <w:r>
-        <w:rPr>
-          <w:rFonts w:ascii="ethiop" w:hAnsi="ethiop" w:cs="Abyssinica SIL"/>
-        </w:rPr>
-        <w:t xml:space="preserve"> ባረም ᎈጠረንም። </w:t>
+        <w:t xml:space="preserve"> የባሔ፣ እያ ጭን በደᎄ ዘንጌ የትፍራነቁፖ ዘንጋ ነሳሑም ኣድግ ባነ ባረም ᎈጠረንም። </w:t>
       </w:r>
       <w:r>
         <w:rPr>

</xml_diff>

<commit_message>
Updates for chiret and qinat.
</commit_message>
<xml_diff>
--- a/documentation/ExtendedEthiopicSamples-Ethiop.docx
+++ b/documentation/ExtendedEthiopicSamples-Ethiop.docx
@@ -1934,6 +1934,13 @@
           <w:rFonts w:ascii="ethiop" w:eastAsia="MS Mincho" w:hAnsi="ethiop" w:cs="Abyssinica SIL"/>
         </w:rPr>
         <w:t>፤</w:t>
+      </w:r>
+      <w:r>
+        <w:rPr>
+          <w:rFonts w:ascii="ethiop" w:eastAsia="MS Mincho" w:hAnsi="ethiop" w:cs="Abyssinica SIL"/>
+          <w:lang w:val="am-ET"/>
+        </w:rPr>
+        <w:t>ቈቘቅቅቅቅቑቘቈቅቅቅ</w:t>
       </w:r>
     </w:p>
     <w:tbl>
@@ -4692,15 +4699,15 @@
       </w:tblPr>
       <w:tblGrid>
         <w:gridCol w:w="540"/>
-        <w:gridCol w:w="4410"/>
-        <w:gridCol w:w="990"/>
-        <w:gridCol w:w="2970"/>
+        <w:gridCol w:w="4200"/>
+        <w:gridCol w:w="1260"/>
+        <w:gridCol w:w="2910"/>
         <w:gridCol w:w="630"/>
       </w:tblGrid>
       <w:tr>
         <w:tc>
           <w:tcPr>
-            <w:tcW w:w="4950" w:type="dxa"/>
+            <w:tcW w:w="4740" w:type="dxa"/>
             <w:gridSpan w:val="2"/>
             <w:tcBorders>
               <w:top w:val="single" w:sz="4" w:space="0" w:color="000000" w:themeColor="text1"/>
@@ -4735,7 +4742,7 @@
         </w:tc>
         <w:tc>
           <w:tcPr>
-            <w:tcW w:w="990" w:type="dxa"/>
+            <w:tcW w:w="1260" w:type="dxa"/>
             <w:tcBorders>
               <w:top w:val="single" w:sz="4" w:space="0" w:color="000000" w:themeColor="text1"/>
               <w:bottom w:val="single" w:sz="4" w:space="0" w:color="000000" w:themeColor="text1"/>
@@ -4764,22 +4771,13 @@
                 <w:sz w:val="20"/>
                 <w:szCs w:val="20"/>
               </w:rPr>
-              <w:t>አጭር፡</w:t>
-            </w:r>
-            <w:r>
-              <w:rPr>
-                <w:rFonts w:ascii="ethiop" w:hAnsi="ethiop" w:cs="Abyssinica SIL"/>
-                <w:sz w:val="20"/>
-                <w:szCs w:val="20"/>
-              </w:rPr>
-              <w:br/>
-              <w:t>ምልክት</w:t>
+              <w:t>አጭር፡ምልክት</w:t>
             </w:r>
           </w:p>
         </w:tc>
         <w:tc>
           <w:tcPr>
-            <w:tcW w:w="2970" w:type="dxa"/>
+            <w:tcW w:w="2910" w:type="dxa"/>
             <w:tcBorders>
               <w:top w:val="single" w:sz="4" w:space="0" w:color="000000" w:themeColor="text1"/>
               <w:left w:val="single" w:sz="4" w:space="0" w:color="000000" w:themeColor="text1"/>
@@ -4912,7 +4910,7 @@
         </w:tc>
         <w:tc>
           <w:tcPr>
-            <w:tcW w:w="4410" w:type="dxa"/>
+            <w:tcW w:w="4200" w:type="dxa"/>
             <w:tcBorders>
               <w:right w:val="single" w:sz="4" w:space="0" w:color="000000" w:themeColor="text1"/>
             </w:tcBorders>
@@ -5051,7 +5049,7 @@
         </w:tc>
         <w:tc>
           <w:tcPr>
-            <w:tcW w:w="990" w:type="dxa"/>
+            <w:tcW w:w="1260" w:type="dxa"/>
             <w:tcBorders>
               <w:right w:val="single" w:sz="4" w:space="0" w:color="000000" w:themeColor="text1"/>
             </w:tcBorders>
@@ -5104,7 +5102,7 @@
         </w:tc>
         <w:tc>
           <w:tcPr>
-            <w:tcW w:w="2970" w:type="dxa"/>
+            <w:tcW w:w="2910" w:type="dxa"/>
             <w:tcBorders>
               <w:left w:val="single" w:sz="4" w:space="0" w:color="000000" w:themeColor="text1"/>
               <w:right w:val="single" w:sz="4" w:space="0" w:color="000000" w:themeColor="text1"/>
@@ -5117,7 +5115,6 @@
           </w:tcPr>
           <w:p>
             <w:pPr>
-              <w:jc w:val="center"/>
               <w:rPr>
                 <w:rFonts w:ascii="ethiop" w:eastAsia="MS Mincho" w:hAnsi="ethiop" w:cs="Abyssinica SIL"/>
               </w:rPr>
@@ -5238,7 +5235,7 @@
         </w:tc>
         <w:tc>
           <w:tcPr>
-            <w:tcW w:w="4410" w:type="dxa"/>
+            <w:tcW w:w="4200" w:type="dxa"/>
             <w:tcBorders>
               <w:right w:val="single" w:sz="4" w:space="0" w:color="000000" w:themeColor="text1"/>
             </w:tcBorders>
@@ -5340,7 +5337,7 @@
         </w:tc>
         <w:tc>
           <w:tcPr>
-            <w:tcW w:w="990" w:type="dxa"/>
+            <w:tcW w:w="1260" w:type="dxa"/>
             <w:tcBorders>
               <w:right w:val="single" w:sz="4" w:space="0" w:color="000000" w:themeColor="text1"/>
             </w:tcBorders>
@@ -5394,7 +5391,7 @@
         </w:tc>
         <w:tc>
           <w:tcPr>
-            <w:tcW w:w="2970" w:type="dxa"/>
+            <w:tcW w:w="2910" w:type="dxa"/>
             <w:tcBorders>
               <w:left w:val="single" w:sz="4" w:space="0" w:color="000000" w:themeColor="text1"/>
               <w:right w:val="single" w:sz="4" w:space="0" w:color="000000" w:themeColor="text1"/>
@@ -5407,7 +5404,6 @@
           </w:tcPr>
           <w:p>
             <w:pPr>
-              <w:jc w:val="center"/>
               <w:rPr>
                 <w:rFonts w:ascii="ethiop" w:eastAsia="MS Mincho" w:hAnsi="ethiop" w:cs="Abyssinica SIL"/>
               </w:rPr>
@@ -5524,7 +5520,7 @@
         </w:tc>
         <w:tc>
           <w:tcPr>
-            <w:tcW w:w="4410" w:type="dxa"/>
+            <w:tcW w:w="4200" w:type="dxa"/>
             <w:tcBorders>
               <w:right w:val="single" w:sz="4" w:space="0" w:color="000000" w:themeColor="text1"/>
             </w:tcBorders>
@@ -5661,7 +5657,7 @@
         </w:tc>
         <w:tc>
           <w:tcPr>
-            <w:tcW w:w="990" w:type="dxa"/>
+            <w:tcW w:w="1260" w:type="dxa"/>
             <w:tcBorders>
               <w:right w:val="single" w:sz="4" w:space="0" w:color="000000" w:themeColor="text1"/>
             </w:tcBorders>
@@ -5713,7 +5709,7 @@
         </w:tc>
         <w:tc>
           <w:tcPr>
-            <w:tcW w:w="2970" w:type="dxa"/>
+            <w:tcW w:w="2910" w:type="dxa"/>
             <w:tcBorders>
               <w:left w:val="single" w:sz="4" w:space="0" w:color="000000" w:themeColor="text1"/>
               <w:right w:val="single" w:sz="4" w:space="0" w:color="000000" w:themeColor="text1"/>
@@ -5727,7 +5723,6 @@
           </w:tcPr>
           <w:p>
             <w:pPr>
-              <w:jc w:val="center"/>
               <w:rPr>
                 <w:rFonts w:ascii="ethiop" w:eastAsia="MS Mincho" w:hAnsi="ethiop" w:cs="Abyssinica SIL"/>
               </w:rPr>
@@ -5844,7 +5839,7 @@
         </w:tc>
         <w:tc>
           <w:tcPr>
-            <w:tcW w:w="4410" w:type="dxa"/>
+            <w:tcW w:w="4200" w:type="dxa"/>
             <w:tcBorders>
               <w:right w:val="single" w:sz="4" w:space="0" w:color="000000" w:themeColor="text1"/>
             </w:tcBorders>
@@ -5981,7 +5976,7 @@
         </w:tc>
         <w:tc>
           <w:tcPr>
-            <w:tcW w:w="990" w:type="dxa"/>
+            <w:tcW w:w="1260" w:type="dxa"/>
             <w:tcBorders>
               <w:right w:val="single" w:sz="4" w:space="0" w:color="000000" w:themeColor="text1"/>
             </w:tcBorders>
@@ -6033,7 +6028,7 @@
         </w:tc>
         <w:tc>
           <w:tcPr>
-            <w:tcW w:w="2970" w:type="dxa"/>
+            <w:tcW w:w="2910" w:type="dxa"/>
             <w:tcBorders>
               <w:left w:val="single" w:sz="4" w:space="0" w:color="000000" w:themeColor="text1"/>
               <w:right w:val="single" w:sz="4" w:space="0" w:color="000000" w:themeColor="text1"/>
@@ -6046,7 +6041,6 @@
           </w:tcPr>
           <w:p>
             <w:pPr>
-              <w:jc w:val="center"/>
               <w:rPr>
                 <w:rFonts w:ascii="ethiop" w:eastAsia="MS Mincho" w:hAnsi="ethiop" w:cs="Abyssinica SIL"/>
               </w:rPr>
@@ -10243,7 +10237,7 @@
                 <w:rFonts w:ascii="ethiop" w:eastAsia="MS Mincho" w:hAnsi="ethiop" w:cs="Abyssinica SIL"/>
                 <w:sz w:val="11"/>
               </w:rPr>
-              <w:t>᎔</w:t>
+              <w:t xml:space="preserve"> ᎔</w:t>
             </w:r>
           </w:rt>
           <w:rubyBase>
@@ -11354,15 +11348,16 @@
       </w:tblPr>
       <w:tblGrid>
         <w:gridCol w:w="450"/>
-        <w:gridCol w:w="4410"/>
-        <w:gridCol w:w="810"/>
-        <w:gridCol w:w="3330"/>
+        <w:gridCol w:w="4110"/>
+        <w:gridCol w:w="1260"/>
+        <w:gridCol w:w="3150"/>
+        <w:gridCol w:w="30"/>
         <w:gridCol w:w="540"/>
       </w:tblGrid>
       <w:tr>
         <w:tc>
           <w:tcPr>
-            <w:tcW w:w="4860" w:type="dxa"/>
+            <w:tcW w:w="4560" w:type="dxa"/>
             <w:gridSpan w:val="2"/>
             <w:tcBorders>
               <w:top w:val="single" w:sz="4" w:space="0" w:color="000000" w:themeColor="text1"/>
@@ -11397,7 +11392,7 @@
         </w:tc>
         <w:tc>
           <w:tcPr>
-            <w:tcW w:w="810" w:type="dxa"/>
+            <w:tcW w:w="1260" w:type="dxa"/>
             <w:tcBorders>
               <w:top w:val="single" w:sz="4" w:space="0" w:color="000000" w:themeColor="text1"/>
               <w:bottom w:val="single" w:sz="4" w:space="0" w:color="000000" w:themeColor="text1"/>
@@ -11426,22 +11421,14 @@
                 <w:sz w:val="20"/>
                 <w:szCs w:val="20"/>
               </w:rPr>
-              <w:t>አጭር፡</w:t>
-            </w:r>
-            <w:r>
-              <w:rPr>
-                <w:rFonts w:ascii="ethiop" w:hAnsi="ethiop" w:cs="Abyssinica SIL"/>
-                <w:sz w:val="20"/>
-                <w:szCs w:val="20"/>
-              </w:rPr>
-              <w:br/>
-              <w:t>ምልክት</w:t>
+              <w:t>አጭር፡ምልክት</w:t>
             </w:r>
           </w:p>
         </w:tc>
         <w:tc>
           <w:tcPr>
-            <w:tcW w:w="3330" w:type="dxa"/>
+            <w:tcW w:w="3180" w:type="dxa"/>
+            <w:gridSpan w:val="2"/>
             <w:tcBorders>
               <w:top w:val="single" w:sz="4" w:space="0" w:color="000000" w:themeColor="text1"/>
               <w:left w:val="single" w:sz="4" w:space="0" w:color="000000" w:themeColor="text1"/>
@@ -11574,7 +11561,7 @@
         </w:tc>
         <w:tc>
           <w:tcPr>
-            <w:tcW w:w="4410" w:type="dxa"/>
+            <w:tcW w:w="4110" w:type="dxa"/>
             <w:tcBorders>
               <w:right w:val="single" w:sz="4" w:space="0" w:color="000000" w:themeColor="text1"/>
             </w:tcBorders>
@@ -11716,7 +11703,7 @@
         </w:tc>
         <w:tc>
           <w:tcPr>
-            <w:tcW w:w="810" w:type="dxa"/>
+            <w:tcW w:w="1260" w:type="dxa"/>
             <w:tcBorders>
               <w:right w:val="single" w:sz="4" w:space="0" w:color="000000" w:themeColor="text1"/>
             </w:tcBorders>
@@ -11806,7 +11793,7 @@
         </w:tc>
         <w:tc>
           <w:tcPr>
-            <w:tcW w:w="3330" w:type="dxa"/>
+            <w:tcW w:w="3150" w:type="dxa"/>
             <w:tcBorders>
               <w:left w:val="single" w:sz="4" w:space="0" w:color="000000" w:themeColor="text1"/>
               <w:right w:val="single" w:sz="4" w:space="0" w:color="000000" w:themeColor="text1"/>
@@ -11819,7 +11806,6 @@
           </w:tcPr>
           <w:p>
             <w:pPr>
-              <w:jc w:val="center"/>
               <w:rPr>
                 <w:rFonts w:ascii="ethiop" w:eastAsia="MS Mincho" w:hAnsi="ethiop" w:cs="Abyssinica SIL"/>
               </w:rPr>
@@ -11848,7 +11834,8 @@
         </w:tc>
         <w:tc>
           <w:tcPr>
-            <w:tcW w:w="540" w:type="dxa"/>
+            <w:tcW w:w="570" w:type="dxa"/>
+            <w:gridSpan w:val="2"/>
             <w:tcBorders>
               <w:left w:val="single" w:sz="4" w:space="0" w:color="000000" w:themeColor="text1"/>
               <w:right w:val="single" w:sz="4" w:space="0" w:color="000000" w:themeColor="text1"/>
@@ -11942,7 +11929,7 @@
         </w:tc>
         <w:tc>
           <w:tcPr>
-            <w:tcW w:w="4410" w:type="dxa"/>
+            <w:tcW w:w="4110" w:type="dxa"/>
             <w:tcBorders>
               <w:right w:val="single" w:sz="4" w:space="0" w:color="000000" w:themeColor="text1"/>
             </w:tcBorders>
@@ -12077,7 +12064,7 @@
         </w:tc>
         <w:tc>
           <w:tcPr>
-            <w:tcW w:w="810" w:type="dxa"/>
+            <w:tcW w:w="1260" w:type="dxa"/>
             <w:tcBorders>
               <w:right w:val="single" w:sz="4" w:space="0" w:color="000000" w:themeColor="text1"/>
             </w:tcBorders>
@@ -12131,7 +12118,7 @@
         </w:tc>
         <w:tc>
           <w:tcPr>
-            <w:tcW w:w="3330" w:type="dxa"/>
+            <w:tcW w:w="3150" w:type="dxa"/>
             <w:tcBorders>
               <w:left w:val="single" w:sz="4" w:space="0" w:color="000000" w:themeColor="text1"/>
               <w:right w:val="single" w:sz="4" w:space="0" w:color="000000" w:themeColor="text1"/>
@@ -12144,7 +12131,6 @@
           </w:tcPr>
           <w:p>
             <w:pPr>
-              <w:jc w:val="center"/>
               <w:rPr>
                 <w:rFonts w:ascii="ethiop" w:eastAsia="MS Mincho" w:hAnsi="ethiop" w:cs="Abyssinica SIL"/>
               </w:rPr>
@@ -12173,7 +12159,8 @@
         </w:tc>
         <w:tc>
           <w:tcPr>
-            <w:tcW w:w="540" w:type="dxa"/>
+            <w:tcW w:w="570" w:type="dxa"/>
+            <w:gridSpan w:val="2"/>
             <w:tcBorders>
               <w:left w:val="single" w:sz="4" w:space="0" w:color="000000" w:themeColor="text1"/>
               <w:right w:val="single" w:sz="4" w:space="0" w:color="000000" w:themeColor="text1"/>
@@ -12269,7 +12256,7 @@
         </w:tc>
         <w:tc>
           <w:tcPr>
-            <w:tcW w:w="4410" w:type="dxa"/>
+            <w:tcW w:w="4110" w:type="dxa"/>
             <w:tcBorders>
               <w:right w:val="single" w:sz="4" w:space="0" w:color="000000" w:themeColor="text1"/>
             </w:tcBorders>
@@ -12437,7 +12424,7 @@
         </w:tc>
         <w:tc>
           <w:tcPr>
-            <w:tcW w:w="810" w:type="dxa"/>
+            <w:tcW w:w="1260" w:type="dxa"/>
             <w:tcBorders>
               <w:right w:val="single" w:sz="4" w:space="0" w:color="000000" w:themeColor="text1"/>
             </w:tcBorders>
@@ -12526,7 +12513,7 @@
         </w:tc>
         <w:tc>
           <w:tcPr>
-            <w:tcW w:w="3330" w:type="dxa"/>
+            <w:tcW w:w="3150" w:type="dxa"/>
             <w:tcBorders>
               <w:left w:val="single" w:sz="4" w:space="0" w:color="000000" w:themeColor="text1"/>
               <w:right w:val="single" w:sz="4" w:space="0" w:color="000000" w:themeColor="text1"/>
@@ -12540,7 +12527,6 @@
           </w:tcPr>
           <w:p>
             <w:pPr>
-              <w:jc w:val="center"/>
               <w:rPr>
                 <w:rFonts w:ascii="ethiop" w:eastAsia="MS Mincho" w:hAnsi="ethiop" w:cs="Abyssinica SIL"/>
               </w:rPr>
@@ -12569,7 +12555,8 @@
         </w:tc>
         <w:tc>
           <w:tcPr>
-            <w:tcW w:w="540" w:type="dxa"/>
+            <w:tcW w:w="570" w:type="dxa"/>
+            <w:gridSpan w:val="2"/>
             <w:tcBorders>
               <w:left w:val="single" w:sz="4" w:space="0" w:color="000000" w:themeColor="text1"/>
               <w:right w:val="single" w:sz="4" w:space="0" w:color="000000" w:themeColor="text1"/>
@@ -14259,7 +14246,7 @@
           <w:noProof/>
         </w:rPr>
         <w:pict>
-          <v:rect id="_x0000_i1028" alt="" style="width:303.25pt;height:.05pt;mso-width-percent:0;mso-height-percent:0;mso-width-percent:0;mso-height-percent:0" o:hrpct="648" o:hralign="center" o:hrstd="t" o:hr="t" fillcolor="#9d9da1" stroked="f"/>
+          <v:rect id="_x0000_i1028" alt="" style="width:270.95pt;height:.05pt;mso-width-percent:0;mso-height-percent:0;mso-width-percent:0;mso-height-percent:0" o:hrpct="579" o:hralign="center" o:hrstd="t" o:hr="t" fillcolor="#9d9da1" stroked="f"/>
         </w:pict>
       </w:r>
     </w:p>
@@ -15746,7 +15733,7 @@
           <w:noProof/>
         </w:rPr>
         <w:pict>
-          <v:rect id="_x0000_i1027" alt="" style="width:303.25pt;height:.05pt;mso-width-percent:0;mso-height-percent:0;mso-width-percent:0;mso-height-percent:0" o:hrpct="648" o:hralign="center" o:hrstd="t" o:hr="t" fillcolor="#9d9da1" stroked="f"/>
+          <v:rect id="_x0000_i1027" alt="" style="width:270.95pt;height:.05pt;mso-width-percent:0;mso-height-percent:0;mso-width-percent:0;mso-height-percent:0" o:hrpct="579" o:hralign="center" o:hrstd="t" o:hr="t" fillcolor="#9d9da1" stroked="f"/>
         </w:pict>
       </w:r>
     </w:p>
@@ -16740,7 +16727,7 @@
           <w:noProof/>
         </w:rPr>
         <w:pict>
-          <v:rect id="_x0000_i1026" alt="" style="width:303.25pt;height:.05pt;mso-width-percent:0;mso-height-percent:0;mso-width-percent:0;mso-height-percent:0" o:hrpct="648" o:hralign="center" o:hrstd="t" o:hr="t" fillcolor="#9d9da1" stroked="f"/>
+          <v:rect id="_x0000_i1026" alt="" style="width:270.95pt;height:.05pt;mso-width-percent:0;mso-height-percent:0;mso-width-percent:0;mso-height-percent:0" o:hrpct="579" o:hralign="center" o:hrstd="t" o:hr="t" fillcolor="#9d9da1" stroked="f"/>
         </w:pict>
       </w:r>
     </w:p>
@@ -17804,7 +17791,7 @@
           <w:noProof/>
         </w:rPr>
         <w:pict>
-          <v:rect id="_x0000_i1025" alt="" style="width:303.25pt;height:.05pt;mso-width-percent:0;mso-height-percent:0;mso-width-percent:0;mso-height-percent:0" o:hrpct="648" o:hralign="center" o:hrstd="t" o:hr="t" fillcolor="#9d9da1" stroked="f"/>
+          <v:rect id="_x0000_i1025" alt="" style="width:270.95pt;height:.05pt;mso-width-percent:0;mso-height-percent:0;mso-width-percent:0;mso-height-percent:0" o:hrpct="579" o:hralign="center" o:hrstd="t" o:hr="t" fillcolor="#9d9da1" stroked="f"/>
         </w:pict>
       </w:r>
     </w:p>

</xml_diff>

<commit_message>
Setting version to 1.000-beta1
</commit_message>
<xml_diff>
--- a/documentation/ExtendedEthiopicSamples-Ethiop.docx
+++ b/documentation/ExtendedEthiopicSamples-Ethiop.docx
@@ -1934,13 +1934,6 @@
           <w:rFonts w:ascii="ethiop" w:eastAsia="MS Mincho" w:hAnsi="ethiop" w:cs="Abyssinica SIL"/>
         </w:rPr>
         <w:t>፤</w:t>
-      </w:r>
-      <w:r>
-        <w:rPr>
-          <w:rFonts w:ascii="ethiop" w:eastAsia="MS Mincho" w:hAnsi="ethiop" w:cs="Abyssinica SIL"/>
-          <w:lang w:val="am-ET"/>
-        </w:rPr>
-        <w:t>ቈቘቅቅቅቅቑቘቈቅቅቅ</w:t>
       </w:r>
     </w:p>
     <w:tbl>
@@ -13529,7 +13522,6 @@
         <w:rPr>
           <w:rFonts w:ascii="ethiop" w:hAnsi="ethiop" w:cs="Abyssinica SIL"/>
         </w:rPr>
-        <w:lastRenderedPageBreak/>
         <w:t>ማይ ሙስታ ባ ብያታ ይስኩⶣማን ኢት ቃይጽኒ ታሢ</w:t>
       </w:r>
     </w:p>
@@ -14246,7 +14238,7 @@
           <w:noProof/>
         </w:rPr>
         <w:pict>
-          <v:rect id="_x0000_i1028" alt="" style="width:270.95pt;height:.05pt;mso-width-percent:0;mso-height-percent:0;mso-width-percent:0;mso-height-percent:0" o:hrpct="579" o:hralign="center" o:hrstd="t" o:hr="t" fillcolor="#9d9da1" stroked="f"/>
+          <v:rect id="_x0000_i1028" alt="" style="width:261.15pt;height:.05pt;mso-width-percent:0;mso-height-percent:0;mso-width-percent:0;mso-height-percent:0" o:hrpct="558" o:hralign="center" o:hrstd="t" o:hr="t" fillcolor="#9d9da1" stroked="f"/>
         </w:pict>
       </w:r>
     </w:p>
@@ -14550,7 +14542,6 @@
         <w:rPr>
           <w:rFonts w:ascii="ethiop" w:hAnsi="ethiop" w:cs="Abyssinica SIL"/>
         </w:rPr>
-        <w:lastRenderedPageBreak/>
         <w:t>ⶡናስናንቂ ይስኬንዶ! ታ ሀይጣ ይስካⶢስ ሲስንዴ። ዬሪ</w:t>
       </w:r>
     </w:p>
@@ -15717,7 +15708,6 @@
         <w:rPr>
           <w:rFonts w:ascii="ethiop" w:hAnsi="ethiop" w:cs="Abyssinica SIL"/>
         </w:rPr>
-        <w:lastRenderedPageBreak/>
         <w:t>ቤስታርጉⶥ ጊባቲንድ ሀይቅንቂ ይስኩዌ።</w:t>
       </w:r>
     </w:p>
@@ -15733,7 +15723,7 @@
           <w:noProof/>
         </w:rPr>
         <w:pict>
-          <v:rect id="_x0000_i1027" alt="" style="width:270.95pt;height:.05pt;mso-width-percent:0;mso-height-percent:0;mso-width-percent:0;mso-height-percent:0" o:hrpct="579" o:hralign="center" o:hrstd="t" o:hr="t" fillcolor="#9d9da1" stroked="f"/>
+          <v:rect id="_x0000_i1027" alt="" style="width:261.15pt;height:.05pt;mso-width-percent:0;mso-height-percent:0;mso-width-percent:0;mso-height-percent:0" o:hrpct="558" o:hralign="center" o:hrstd="t" o:hr="t" fillcolor="#9d9da1" stroked="f"/>
         </w:pict>
       </w:r>
     </w:p>
@@ -15882,6 +15872,7 @@
         <w:rPr>
           <w:rFonts w:ascii="ethiop" w:hAnsi="ethiop" w:cs="Abyssinica SIL"/>
         </w:rPr>
+        <w:lastRenderedPageBreak/>
         <w:t xml:space="preserve">ጋህ ኤትኩⶥ ሶይ አሣ ጊዜዎ። </w:t>
       </w:r>
       <w:r>
@@ -16711,7 +16702,6 @@
         <w:rPr>
           <w:rFonts w:ascii="ethiop" w:hAnsi="ethiop" w:cs="Abyssinica SIL"/>
         </w:rPr>
-        <w:lastRenderedPageBreak/>
         <w:t>አሥንሴንዴ።</w:t>
       </w:r>
     </w:p>
@@ -16727,7 +16717,7 @@
           <w:noProof/>
         </w:rPr>
         <w:pict>
-          <v:rect id="_x0000_i1026" alt="" style="width:270.95pt;height:.05pt;mso-width-percent:0;mso-height-percent:0;mso-width-percent:0;mso-height-percent:0" o:hrpct="579" o:hralign="center" o:hrstd="t" o:hr="t" fillcolor="#9d9da1" stroked="f"/>
+          <v:rect id="_x0000_i1026" alt="" style="width:261.15pt;height:.05pt;mso-width-percent:0;mso-height-percent:0;mso-width-percent:0;mso-height-percent:0" o:hrpct="558" o:hralign="center" o:hrstd="t" o:hr="t" fillcolor="#9d9da1" stroked="f"/>
         </w:pict>
       </w:r>
     </w:p>
@@ -16939,6 +16929,7 @@
         <w:rPr>
           <w:rFonts w:ascii="ethiop" w:hAnsi="ethiop" w:cs="Abyssinica SIL"/>
         </w:rPr>
+        <w:lastRenderedPageBreak/>
         <w:t>ይስኩⶢስ ይያም ይሥኒ ታሥንሲ ኢት ታሣም ይንቲ ቆሊ</w:t>
       </w:r>
     </w:p>
@@ -17718,7 +17709,6 @@
         <w:rPr>
           <w:rFonts w:ascii="ethiop" w:hAnsi="ethiop" w:cs="Abyssinica SIL"/>
         </w:rPr>
-        <w:lastRenderedPageBreak/>
         <w:t>ይስኩዌ። ኡⶥዎጥን አሢ ኤርቲ ይስኩⶢ ካንግ ኢታ</w:t>
       </w:r>
     </w:p>
@@ -17791,7 +17781,7 @@
           <w:noProof/>
         </w:rPr>
         <w:pict>
-          <v:rect id="_x0000_i1025" alt="" style="width:270.95pt;height:.05pt;mso-width-percent:0;mso-height-percent:0;mso-width-percent:0;mso-height-percent:0" o:hrpct="579" o:hralign="center" o:hrstd="t" o:hr="t" fillcolor="#9d9da1" stroked="f"/>
+          <v:rect id="_x0000_i1025" alt="" style="width:261.15pt;height:.05pt;mso-width-percent:0;mso-height-percent:0;mso-width-percent:0;mso-height-percent:0" o:hrpct="558" o:hralign="center" o:hrstd="t" o:hr="t" fillcolor="#9d9da1" stroked="f"/>
         </w:pict>
       </w:r>
     </w:p>
@@ -18031,6 +18021,7 @@
           <w:rFonts w:ascii="ethiop" w:hAnsi="ethiop" w:cs="Abyssinica SIL"/>
           <w:vertAlign w:val="superscript"/>
         </w:rPr>
+        <w:lastRenderedPageBreak/>
         <w:t>5</w:t>
       </w:r>
       <w:r>
@@ -18713,7 +18704,6 @@
         <w:rPr>
           <w:rFonts w:ascii="ethiop" w:hAnsi="ethiop" w:cs="Abyssinica SIL"/>
         </w:rPr>
-        <w:lastRenderedPageBreak/>
         <w:t>ይስኩⶢንድ ይንታይቅን ጾጽቃን ባ ይስታን ኪርስቲያንንድ</w:t>
       </w:r>
     </w:p>
@@ -19931,69 +19921,69 @@
         <w:rPr>
           <w:rFonts w:ascii="ethiop" w:hAnsi="ethiop" w:cs="Abyssinica SIL"/>
         </w:rPr>
+        <w:t>አውጦም ጔታ በ</w:t>
+      </w:r>
+      <w:r>
+        <w:rPr>
+          <w:rFonts w:ascii="ethiop" w:eastAsia="SunDotum" w:hAnsi="ethiop" w:cs="Abyssinica SIL"/>
+        </w:rPr>
+        <w:t>ⷕናኹ</w:t>
+      </w:r>
+      <w:r>
+        <w:rPr>
+          <w:rFonts w:ascii="ethiop" w:hAnsi="ethiop" w:cs="Abyssinica SIL"/>
+        </w:rPr>
+        <w:t xml:space="preserve"> የተኳን ነብሳኹ ያተርፌ ይዀለ</w:t>
+      </w:r>
+    </w:p>
+    <w:p>
+      <w:pPr>
+        <w:pStyle w:val="HTMLPreformatted"/>
+        <w:rPr>
+          <w:rFonts w:ascii="ethiop" w:hAnsi="ethiop" w:cs="Abyssinica SIL"/>
+        </w:rPr>
+      </w:pPr>
+      <w:r>
+        <w:rPr>
+          <w:rFonts w:ascii="ethiop" w:hAnsi="ethiop" w:cs="Abyssinica SIL"/>
+        </w:rPr>
+        <w:t>ቃር በሜርነት ተቀፐሮ።</w:t>
+      </w:r>
+    </w:p>
+    <w:p>
+      <w:pPr>
+        <w:pStyle w:val="HTMLPreformatted"/>
+        <w:rPr>
+          <w:rFonts w:ascii="ethiop" w:hAnsi="ethiop" w:cs="Abyssinica SIL"/>
+        </w:rPr>
+      </w:pPr>
+    </w:p>
+    <w:p>
+      <w:pPr>
+        <w:pStyle w:val="HTMLPreformatted"/>
+        <w:rPr>
+          <w:rFonts w:ascii="ethiop" w:hAnsi="ethiop" w:cs="Abyssinica SIL"/>
+        </w:rPr>
+      </w:pPr>
+      <w:r>
+        <w:rPr>
+          <w:rFonts w:ascii="ethiop" w:hAnsi="ethiop" w:cs="Abyssinica SIL"/>
+        </w:rPr>
+        <w:t>22. ቃረታ በሜና ታትየሶ ሰብ ኽሮ ባንኸሬ</w:t>
+      </w:r>
+    </w:p>
+    <w:p>
+      <w:pPr>
+        <w:pStyle w:val="HTMLPreformatted"/>
+        <w:rPr>
+          <w:rFonts w:ascii="ethiop" w:hAnsi="ethiop" w:cs="Abyssinica SIL"/>
+        </w:rPr>
+      </w:pPr>
+      <w:r>
+        <w:rPr>
+          <w:rFonts w:ascii="ethiop" w:hAnsi="ethiop" w:cs="Abyssinica SIL"/>
+        </w:rPr>
         <w:lastRenderedPageBreak/>
-        <w:t>አውጦም ጔታ በ</w:t>
-      </w:r>
-      <w:r>
-        <w:rPr>
-          <w:rFonts w:ascii="ethiop" w:eastAsia="SunDotum" w:hAnsi="ethiop" w:cs="Abyssinica SIL"/>
-        </w:rPr>
-        <w:t>ⷕናኹ</w:t>
-      </w:r>
-      <w:r>
-        <w:rPr>
-          <w:rFonts w:ascii="ethiop" w:hAnsi="ethiop" w:cs="Abyssinica SIL"/>
-        </w:rPr>
-        <w:t xml:space="preserve"> የተኳን ነብሳኹ ያተርፌ ይዀለ</w:t>
-      </w:r>
-    </w:p>
-    <w:p>
-      <w:pPr>
-        <w:pStyle w:val="HTMLPreformatted"/>
-        <w:rPr>
-          <w:rFonts w:ascii="ethiop" w:hAnsi="ethiop" w:cs="Abyssinica SIL"/>
-        </w:rPr>
-      </w:pPr>
-      <w:r>
-        <w:rPr>
-          <w:rFonts w:ascii="ethiop" w:hAnsi="ethiop" w:cs="Abyssinica SIL"/>
-        </w:rPr>
-        <w:t>ቃር በሜርነት ተቀፐሮ።</w:t>
-      </w:r>
-    </w:p>
-    <w:p>
-      <w:pPr>
-        <w:pStyle w:val="HTMLPreformatted"/>
-        <w:rPr>
-          <w:rFonts w:ascii="ethiop" w:hAnsi="ethiop" w:cs="Abyssinica SIL"/>
-        </w:rPr>
-      </w:pPr>
-    </w:p>
-    <w:p>
-      <w:pPr>
-        <w:pStyle w:val="HTMLPreformatted"/>
-        <w:rPr>
-          <w:rFonts w:ascii="ethiop" w:hAnsi="ethiop" w:cs="Abyssinica SIL"/>
-        </w:rPr>
-      </w:pPr>
-      <w:r>
-        <w:rPr>
-          <w:rFonts w:ascii="ethiop" w:hAnsi="ethiop" w:cs="Abyssinica SIL"/>
-        </w:rPr>
-        <w:t>22. ቃረታ በሜና ታትየሶ ሰብ ኽሮ ባንኸሬ</w:t>
-      </w:r>
-    </w:p>
-    <w:p>
-      <w:pPr>
-        <w:pStyle w:val="HTMLPreformatted"/>
-        <w:rPr>
-          <w:rFonts w:ascii="ethiop" w:hAnsi="ethiop" w:cs="Abyssinica SIL"/>
-        </w:rPr>
-      </w:pPr>
-      <w:r>
-        <w:rPr>
-          <w:rFonts w:ascii="ethiop" w:hAnsi="ethiop" w:cs="Abyssinica SIL"/>
-        </w:rPr>
         <w:t>የገጋኹ ቅማመርኹም እማት ሰሞም ኤቾቶ ሰብ</w:t>
       </w:r>
     </w:p>
@@ -20911,161 +20901,161 @@
         <w:rPr>
           <w:rFonts w:ascii="ethiop" w:hAnsi="ethiop" w:cs="Abyssinica SIL"/>
         </w:rPr>
+        <w:t xml:space="preserve">ቃር ታቲቦዩ </w:t>
+      </w:r>
+      <w:r>
+        <w:rPr>
+          <w:rFonts w:ascii="Cambria" w:hAnsi="Cambria" w:cs="Cambria"/>
+        </w:rPr>
+        <w:t>«</w:t>
+      </w:r>
+      <w:r>
+        <w:rPr>
+          <w:rFonts w:ascii="ethiop" w:hAnsi="ethiop" w:cs="Abyssinica SIL"/>
+        </w:rPr>
+        <w:t>ቦኼ ቃር ወሮ የትኸተርኹዊ የሟቅኹ</w:t>
+      </w:r>
+    </w:p>
+    <w:p>
+      <w:pPr>
+        <w:pStyle w:val="HTMLPreformatted"/>
+        <w:rPr>
+          <w:rFonts w:ascii="ethiop" w:hAnsi="ethiop" w:cs="Abyssinica SIL"/>
+        </w:rPr>
+      </w:pPr>
+      <w:r>
+        <w:rPr>
+          <w:rFonts w:ascii="ethiop" w:hAnsi="ethiop" w:cs="Abyssinica SIL"/>
+        </w:rPr>
+        <w:t>ጥᎈቦ</w:t>
+      </w:r>
+      <w:r>
+        <w:rPr>
+          <w:rFonts w:ascii="Cambria" w:hAnsi="Cambria" w:cs="Cambria"/>
+        </w:rPr>
+        <w:t>»</w:t>
+      </w:r>
+      <w:r>
+        <w:rPr>
+          <w:rFonts w:ascii="ethiop" w:hAnsi="ethiop" w:cs="Abyssinica SIL"/>
+        </w:rPr>
+        <w:t xml:space="preserve"> ብትብሮዩ ምር ያሜሮ? 17. እማት ኧመሮት</w:t>
+      </w:r>
+    </w:p>
+    <w:p>
+      <w:pPr>
+        <w:pStyle w:val="HTMLPreformatted"/>
+        <w:rPr>
+          <w:rFonts w:ascii="ethiop" w:hAnsi="ethiop" w:cs="Abyssinica SIL"/>
+        </w:rPr>
+      </w:pPr>
+      <w:r>
+        <w:rPr>
+          <w:rFonts w:ascii="ethiop" w:hAnsi="ethiop" w:cs="Abyssinica SIL"/>
+        </w:rPr>
+        <w:t>ወኼ ሜና ኤባር የᎀተው።</w:t>
+      </w:r>
+    </w:p>
+    <w:p>
+      <w:pPr>
+        <w:pStyle w:val="HTMLPreformatted"/>
+        <w:rPr>
+          <w:rFonts w:ascii="ethiop" w:hAnsi="ethiop" w:cs="Abyssinica SIL"/>
+        </w:rPr>
+      </w:pPr>
+    </w:p>
+    <w:p>
+      <w:pPr>
+        <w:pStyle w:val="HTMLPreformatted"/>
+        <w:rPr>
+          <w:rFonts w:ascii="ethiop" w:hAnsi="ethiop" w:cs="Abyssinica SIL"/>
+        </w:rPr>
+      </w:pPr>
+      <w:r>
+        <w:rPr>
+          <w:rFonts w:ascii="ethiop" w:hAnsi="ethiop" w:cs="Abyssinica SIL"/>
+        </w:rPr>
+        <w:t xml:space="preserve">18. ቢኸርም አኸ </w:t>
+      </w:r>
+      <w:r>
+        <w:rPr>
+          <w:rFonts w:ascii="Cambria" w:hAnsi="Cambria" w:cs="Cambria"/>
+        </w:rPr>
+        <w:t>«</w:t>
+      </w:r>
+      <w:r>
+        <w:rPr>
+          <w:rFonts w:ascii="ethiop" w:hAnsi="ethiop" w:cs="Abyssinica SIL"/>
+        </w:rPr>
+        <w:t>አታት ሰብ ኧመሮት ነረን፤</w:t>
+      </w:r>
+    </w:p>
+    <w:p>
+      <w:pPr>
+        <w:pStyle w:val="HTMLPreformatted"/>
+        <w:rPr>
+          <w:rFonts w:ascii="ethiop" w:hAnsi="ethiop" w:cs="Abyssinica SIL"/>
+        </w:rPr>
+      </w:pPr>
+      <w:r>
+        <w:rPr>
+          <w:rFonts w:ascii="ethiop" w:hAnsi="ethiop" w:cs="Abyssinica SIL"/>
+        </w:rPr>
+        <w:t>እንጐድ ሰብ ወኼ ሜና ነረን</w:t>
+      </w:r>
+      <w:r>
+        <w:rPr>
+          <w:rFonts w:ascii="Cambria" w:hAnsi="Cambria" w:cs="Cambria"/>
+        </w:rPr>
+        <w:t>»</w:t>
+      </w:r>
+      <w:r>
+        <w:rPr>
+          <w:rFonts w:ascii="ethiop" w:hAnsi="ethiop" w:cs="Abyssinica SIL"/>
+        </w:rPr>
+        <w:t xml:space="preserve"> ትብር። እንዴ</w:t>
+      </w:r>
+    </w:p>
+    <w:p>
+      <w:pPr>
+        <w:pStyle w:val="HTMLPreformatted"/>
+        <w:rPr>
+          <w:rFonts w:ascii="ethiop" w:hAnsi="ethiop" w:cs="Abyssinica SIL"/>
+        </w:rPr>
+      </w:pPr>
+      <w:r>
+        <w:rPr>
+          <w:rFonts w:ascii="ethiop" w:hAnsi="ethiop" w:cs="Abyssinica SIL"/>
+        </w:rPr>
+        <w:t>ያመርኸወ ተሜናኸ ቤትርም አተዤ፤ እያም ያመርኽወ</w:t>
+      </w:r>
+    </w:p>
+    <w:p>
+      <w:pPr>
+        <w:pStyle w:val="HTMLPreformatted"/>
+        <w:rPr>
+          <w:rFonts w:ascii="ethiop" w:hAnsi="ethiop" w:cs="Abyssinica SIL"/>
+        </w:rPr>
+      </w:pPr>
+      <w:r>
+        <w:rPr>
+          <w:rFonts w:ascii="ethiop" w:hAnsi="ethiop" w:cs="Abyssinica SIL"/>
+        </w:rPr>
+        <w:t>በሜናና አተዥኸሸ። 19. አኸ እማት ጔታ ያነ ኸማ</w:t>
+      </w:r>
+    </w:p>
+    <w:p>
+      <w:pPr>
+        <w:pStyle w:val="HTMLPreformatted"/>
+        <w:rPr>
+          <w:rFonts w:ascii="ethiop" w:hAnsi="ethiop" w:cs="Abyssinica SIL"/>
+        </w:rPr>
+      </w:pPr>
+      <w:r>
+        <w:rPr>
+          <w:rFonts w:ascii="ethiop" w:hAnsi="ethiop" w:cs="Abyssinica SIL"/>
+        </w:rPr>
         <w:lastRenderedPageBreak/>
-        <w:t xml:space="preserve">ቃር ታቲቦዩ </w:t>
-      </w:r>
-      <w:r>
-        <w:rPr>
-          <w:rFonts w:ascii="Cambria" w:hAnsi="Cambria" w:cs="Cambria"/>
-        </w:rPr>
-        <w:t>«</w:t>
-      </w:r>
-      <w:r>
-        <w:rPr>
-          <w:rFonts w:ascii="ethiop" w:hAnsi="ethiop" w:cs="Abyssinica SIL"/>
-        </w:rPr>
-        <w:t>ቦኼ ቃር ወሮ የትኸተርኹዊ የሟቅኹ</w:t>
-      </w:r>
-    </w:p>
-    <w:p>
-      <w:pPr>
-        <w:pStyle w:val="HTMLPreformatted"/>
-        <w:rPr>
-          <w:rFonts w:ascii="ethiop" w:hAnsi="ethiop" w:cs="Abyssinica SIL"/>
-        </w:rPr>
-      </w:pPr>
-      <w:r>
-        <w:rPr>
-          <w:rFonts w:ascii="ethiop" w:hAnsi="ethiop" w:cs="Abyssinica SIL"/>
-        </w:rPr>
-        <w:t>ጥᎈቦ</w:t>
-      </w:r>
-      <w:r>
-        <w:rPr>
-          <w:rFonts w:ascii="Cambria" w:hAnsi="Cambria" w:cs="Cambria"/>
-        </w:rPr>
-        <w:t>»</w:t>
-      </w:r>
-      <w:r>
-        <w:rPr>
-          <w:rFonts w:ascii="ethiop" w:hAnsi="ethiop" w:cs="Abyssinica SIL"/>
-        </w:rPr>
-        <w:t xml:space="preserve"> ብትብሮዩ ምር ያሜሮ? 17. እማት ኧመሮት</w:t>
-      </w:r>
-    </w:p>
-    <w:p>
-      <w:pPr>
-        <w:pStyle w:val="HTMLPreformatted"/>
-        <w:rPr>
-          <w:rFonts w:ascii="ethiop" w:hAnsi="ethiop" w:cs="Abyssinica SIL"/>
-        </w:rPr>
-      </w:pPr>
-      <w:r>
-        <w:rPr>
-          <w:rFonts w:ascii="ethiop" w:hAnsi="ethiop" w:cs="Abyssinica SIL"/>
-        </w:rPr>
-        <w:t>ወኼ ሜና ኤባር የᎀተው።</w:t>
-      </w:r>
-    </w:p>
-    <w:p>
-      <w:pPr>
-        <w:pStyle w:val="HTMLPreformatted"/>
-        <w:rPr>
-          <w:rFonts w:ascii="ethiop" w:hAnsi="ethiop" w:cs="Abyssinica SIL"/>
-        </w:rPr>
-      </w:pPr>
-    </w:p>
-    <w:p>
-      <w:pPr>
-        <w:pStyle w:val="HTMLPreformatted"/>
-        <w:rPr>
-          <w:rFonts w:ascii="ethiop" w:hAnsi="ethiop" w:cs="Abyssinica SIL"/>
-        </w:rPr>
-      </w:pPr>
-      <w:r>
-        <w:rPr>
-          <w:rFonts w:ascii="ethiop" w:hAnsi="ethiop" w:cs="Abyssinica SIL"/>
-        </w:rPr>
-        <w:t xml:space="preserve">18. ቢኸርም አኸ </w:t>
-      </w:r>
-      <w:r>
-        <w:rPr>
-          <w:rFonts w:ascii="Cambria" w:hAnsi="Cambria" w:cs="Cambria"/>
-        </w:rPr>
-        <w:t>«</w:t>
-      </w:r>
-      <w:r>
-        <w:rPr>
-          <w:rFonts w:ascii="ethiop" w:hAnsi="ethiop" w:cs="Abyssinica SIL"/>
-        </w:rPr>
-        <w:t>አታት ሰብ ኧመሮት ነረን፤</w:t>
-      </w:r>
-    </w:p>
-    <w:p>
-      <w:pPr>
-        <w:pStyle w:val="HTMLPreformatted"/>
-        <w:rPr>
-          <w:rFonts w:ascii="ethiop" w:hAnsi="ethiop" w:cs="Abyssinica SIL"/>
-        </w:rPr>
-      </w:pPr>
-      <w:r>
-        <w:rPr>
-          <w:rFonts w:ascii="ethiop" w:hAnsi="ethiop" w:cs="Abyssinica SIL"/>
-        </w:rPr>
-        <w:t>እንጐድ ሰብ ወኼ ሜና ነረን</w:t>
-      </w:r>
-      <w:r>
-        <w:rPr>
-          <w:rFonts w:ascii="Cambria" w:hAnsi="Cambria" w:cs="Cambria"/>
-        </w:rPr>
-        <w:t>»</w:t>
-      </w:r>
-      <w:r>
-        <w:rPr>
-          <w:rFonts w:ascii="ethiop" w:hAnsi="ethiop" w:cs="Abyssinica SIL"/>
-        </w:rPr>
-        <w:t xml:space="preserve"> ትብር። እንዴ</w:t>
-      </w:r>
-    </w:p>
-    <w:p>
-      <w:pPr>
-        <w:pStyle w:val="HTMLPreformatted"/>
-        <w:rPr>
-          <w:rFonts w:ascii="ethiop" w:hAnsi="ethiop" w:cs="Abyssinica SIL"/>
-        </w:rPr>
-      </w:pPr>
-      <w:r>
-        <w:rPr>
-          <w:rFonts w:ascii="ethiop" w:hAnsi="ethiop" w:cs="Abyssinica SIL"/>
-        </w:rPr>
-        <w:t>ያመርኸወ ተሜናኸ ቤትርም አተዤ፤ እያም ያመርኽወ</w:t>
-      </w:r>
-    </w:p>
-    <w:p>
-      <w:pPr>
-        <w:pStyle w:val="HTMLPreformatted"/>
-        <w:rPr>
-          <w:rFonts w:ascii="ethiop" w:hAnsi="ethiop" w:cs="Abyssinica SIL"/>
-        </w:rPr>
-      </w:pPr>
-      <w:r>
-        <w:rPr>
-          <w:rFonts w:ascii="ethiop" w:hAnsi="ethiop" w:cs="Abyssinica SIL"/>
-        </w:rPr>
-        <w:t>በሜናና አተዥኸሸ። 19. አኸ እማት ጔታ ያነ ኸማ</w:t>
-      </w:r>
-    </w:p>
-    <w:p>
-      <w:pPr>
-        <w:pStyle w:val="HTMLPreformatted"/>
-        <w:rPr>
-          <w:rFonts w:ascii="ethiop" w:hAnsi="ethiop" w:cs="Abyssinica SIL"/>
-        </w:rPr>
-      </w:pPr>
-      <w:r>
-        <w:rPr>
-          <w:rFonts w:ascii="ethiop" w:hAnsi="ethiop" w:cs="Abyssinica SIL"/>
-        </w:rPr>
         <w:t>ታምር። ዝም ኧመሮታኽ ወኼው። ቢኸርም</w:t>
       </w:r>
     </w:p>
@@ -21837,195 +21827,195 @@
           <w:rFonts w:ascii="ethiop" w:hAnsi="ethiop" w:cs="Abyssinica SIL"/>
           <w:u w:val="thick"/>
         </w:rPr>
+        <w:t>የጔታ ኻሪነት ተኸተር</w:t>
+      </w:r>
+    </w:p>
+    <w:p>
+      <w:pPr>
+        <w:pStyle w:val="HTMLPreformatted"/>
+        <w:rPr>
+          <w:rFonts w:ascii="ethiop" w:hAnsi="ethiop" w:cs="Abyssinica SIL"/>
+        </w:rPr>
+      </w:pPr>
+    </w:p>
+    <w:p>
+      <w:pPr>
+        <w:pStyle w:val="HTMLPreformatted"/>
+        <w:rPr>
+          <w:rFonts w:ascii="ethiop" w:hAnsi="ethiop" w:cs="Abyssinica SIL"/>
+        </w:rPr>
+      </w:pPr>
+      <w:r>
+        <w:rPr>
+          <w:rFonts w:ascii="ethiop" w:hAnsi="ethiop" w:cs="Abyssinica SIL"/>
+        </w:rPr>
+        <w:t>13. ታኹ ግብት ኻሪ የቤሰረ ሰብ ሟኑ? በኻሪነትም</w:t>
+      </w:r>
+    </w:p>
+    <w:p>
+      <w:pPr>
+        <w:pStyle w:val="HTMLPreformatted"/>
+        <w:rPr>
+          <w:rFonts w:ascii="ethiop" w:hAnsi="ethiop" w:cs="Abyssinica SIL"/>
+        </w:rPr>
+      </w:pPr>
+      <w:r>
+        <w:rPr>
+          <w:rFonts w:ascii="ethiop" w:hAnsi="ethiop" w:cs="Abyssinica SIL"/>
+        </w:rPr>
+        <w:t>በሜርነት ይትቾት ሜና ቦኼ አመረታ የቶትም ያተዥ።</w:t>
+      </w:r>
+    </w:p>
+    <w:p>
+      <w:pPr>
+        <w:pStyle w:val="HTMLPreformatted"/>
+        <w:rPr>
+          <w:rFonts w:ascii="ethiop" w:hAnsi="ethiop" w:cs="Abyssinica SIL"/>
+        </w:rPr>
+      </w:pPr>
+      <w:r>
+        <w:rPr>
+          <w:rFonts w:ascii="ethiop" w:hAnsi="ethiop" w:cs="Abyssinica SIL"/>
+        </w:rPr>
+        <w:t>14. ይመርር ᎀያትም ነግረግነት በ</w:t>
+      </w:r>
+      <w:r>
+        <w:rPr>
+          <w:rFonts w:ascii="ethiop" w:eastAsia="SunDotum" w:hAnsi="ethiop" w:cs="Abyssinica SIL"/>
+        </w:rPr>
+        <w:t>ⷕናኹ</w:t>
+      </w:r>
+      <w:r>
+        <w:rPr>
+          <w:rFonts w:ascii="ethiop" w:hAnsi="ethiop" w:cs="Abyssinica SIL"/>
+        </w:rPr>
+        <w:t xml:space="preserve"> ቢረብር</w:t>
+      </w:r>
+    </w:p>
+    <w:p>
+      <w:pPr>
+        <w:pStyle w:val="HTMLPreformatted"/>
+        <w:rPr>
+          <w:rFonts w:ascii="ethiop" w:hAnsi="ethiop" w:cs="Abyssinica SIL"/>
+        </w:rPr>
+      </w:pPr>
+      <w:r>
+        <w:rPr>
+          <w:rFonts w:ascii="ethiop" w:hAnsi="ethiop" w:cs="Abyssinica SIL"/>
+        </w:rPr>
+        <w:t>ኤያሟቅጥኹ፤ በውረም ቃር እንፈጠርኹ። 15. ዝኽ</w:t>
+      </w:r>
+    </w:p>
+    <w:p>
+      <w:pPr>
+        <w:pStyle w:val="HTMLPreformatted"/>
+        <w:rPr>
+          <w:rFonts w:ascii="ethiop" w:hAnsi="ethiop" w:cs="Abyssinica SIL"/>
+        </w:rPr>
+      </w:pPr>
+      <w:r>
+        <w:rPr>
+          <w:rFonts w:ascii="ethiop" w:hAnsi="ethiop" w:cs="Abyssinica SIL"/>
+        </w:rPr>
+        <w:t>ᎀያትም ነግረግነት ያነወ ኻሪነት ተአለም፥ ተምስየንዳም</w:t>
+      </w:r>
+    </w:p>
+    <w:p>
+      <w:pPr>
+        <w:pStyle w:val="HTMLPreformatted"/>
+        <w:rPr>
+          <w:rFonts w:ascii="ethiop" w:hAnsi="ethiop" w:cs="Abyssinica SIL"/>
+        </w:rPr>
+      </w:pPr>
+      <w:r>
+        <w:rPr>
+          <w:rFonts w:ascii="ethiop" w:hAnsi="ethiop" w:cs="Abyssinica SIL"/>
+        </w:rPr>
+        <w:t>ተሼጣኑ ባንኸሬ ተጔቴ አንኸረ። 16. ᎀያትም</w:t>
+      </w:r>
+    </w:p>
+    <w:p>
+      <w:pPr>
+        <w:pStyle w:val="HTMLPreformatted"/>
+        <w:rPr>
+          <w:rFonts w:ascii="ethiop" w:hAnsi="ethiop" w:cs="Abyssinica SIL"/>
+        </w:rPr>
+      </w:pPr>
+      <w:r>
+        <w:rPr>
+          <w:rFonts w:ascii="ethiop" w:hAnsi="ethiop" w:cs="Abyssinica SIL"/>
+        </w:rPr>
+        <w:t>ነግረግነት ባነቦᎌ መደር ኽያትም ᎃጥጥ ሜና እንም</w:t>
+      </w:r>
+    </w:p>
+    <w:p>
+      <w:pPr>
+        <w:pStyle w:val="HTMLPreformatted"/>
+        <w:rPr>
+          <w:rFonts w:ascii="ethiop" w:hAnsi="ethiop" w:cs="Abyssinica SIL"/>
+        </w:rPr>
+      </w:pPr>
+      <w:r>
+        <w:rPr>
+          <w:rFonts w:ascii="ethiop" w:hAnsi="ethiop" w:cs="Abyssinica SIL"/>
+        </w:rPr>
+        <w:t>ነረቦ። 17. ተጔቴ ይረኽዊ ኻሪነት ይፍትወረር</w:t>
+      </w:r>
+    </w:p>
+    <w:p>
+      <w:pPr>
+        <w:pStyle w:val="HTMLPreformatted"/>
+        <w:rPr>
+          <w:rFonts w:ascii="ethiop" w:hAnsi="ethiop" w:cs="Abyssinica SIL"/>
+        </w:rPr>
+      </w:pPr>
+      <w:r>
+        <w:rPr>
+          <w:rFonts w:ascii="ethiop" w:hAnsi="ethiop" w:cs="Abyssinica SIL"/>
+        </w:rPr>
+        <w:t>ንጡኹ። ተኽም አንᎀ ሻ᎖ቹ፥ ተራዜቡ ይታዘዝ፤</w:t>
+      </w:r>
+    </w:p>
+    <w:p>
+      <w:pPr>
+        <w:pStyle w:val="HTMLPreformatted"/>
+        <w:rPr>
+          <w:rFonts w:ascii="ethiop" w:hAnsi="ethiop" w:cs="Abyssinica SIL"/>
+        </w:rPr>
+      </w:pPr>
+      <w:r>
+        <w:rPr>
+          <w:rFonts w:ascii="ethiop" w:hAnsi="ethiop" w:cs="Abyssinica SIL"/>
+        </w:rPr>
+        <w:t>አትማጣጩ፥ ወኼ ወማ የሜናወው፥ ኤያደላ፥ ኸጥነት</w:t>
+      </w:r>
+    </w:p>
+    <w:p>
+      <w:pPr>
+        <w:pStyle w:val="HTMLPreformatted"/>
+        <w:rPr>
+          <w:rFonts w:ascii="ethiop" w:hAnsi="ethiop" w:cs="Abyssinica SIL"/>
+        </w:rPr>
+      </w:pPr>
+      <w:r>
+        <w:rPr>
+          <w:rFonts w:ascii="ethiop" w:hAnsi="ethiop" w:cs="Abyssinica SIL"/>
+        </w:rPr>
+        <w:t>ኤነወው። 18. ሽናት ይረምዶ ሰብ በሽናት ዘኖም</w:t>
+      </w:r>
+    </w:p>
+    <w:p>
+      <w:pPr>
+        <w:pStyle w:val="HTMLPreformatted"/>
+        <w:rPr>
+          <w:rFonts w:ascii="ethiop" w:hAnsi="ethiop" w:cs="Abyssinica SIL"/>
+        </w:rPr>
+      </w:pPr>
+      <w:r>
+        <w:rPr>
+          <w:rFonts w:ascii="ethiop" w:hAnsi="ethiop" w:cs="Abyssinica SIL"/>
+        </w:rPr>
         <w:lastRenderedPageBreak/>
-        <w:t>የጔታ ኻሪነት ተኸተር</w:t>
-      </w:r>
-    </w:p>
-    <w:p>
-      <w:pPr>
-        <w:pStyle w:val="HTMLPreformatted"/>
-        <w:rPr>
-          <w:rFonts w:ascii="ethiop" w:hAnsi="ethiop" w:cs="Abyssinica SIL"/>
-        </w:rPr>
-      </w:pPr>
-    </w:p>
-    <w:p>
-      <w:pPr>
-        <w:pStyle w:val="HTMLPreformatted"/>
-        <w:rPr>
-          <w:rFonts w:ascii="ethiop" w:hAnsi="ethiop" w:cs="Abyssinica SIL"/>
-        </w:rPr>
-      </w:pPr>
-      <w:r>
-        <w:rPr>
-          <w:rFonts w:ascii="ethiop" w:hAnsi="ethiop" w:cs="Abyssinica SIL"/>
-        </w:rPr>
-        <w:t>13. ታኹ ግብት ኻሪ የቤሰረ ሰብ ሟኑ? በኻሪነትም</w:t>
-      </w:r>
-    </w:p>
-    <w:p>
-      <w:pPr>
-        <w:pStyle w:val="HTMLPreformatted"/>
-        <w:rPr>
-          <w:rFonts w:ascii="ethiop" w:hAnsi="ethiop" w:cs="Abyssinica SIL"/>
-        </w:rPr>
-      </w:pPr>
-      <w:r>
-        <w:rPr>
-          <w:rFonts w:ascii="ethiop" w:hAnsi="ethiop" w:cs="Abyssinica SIL"/>
-        </w:rPr>
-        <w:t>በሜርነት ይትቾት ሜና ቦኼ አመረታ የቶትም ያተዥ።</w:t>
-      </w:r>
-    </w:p>
-    <w:p>
-      <w:pPr>
-        <w:pStyle w:val="HTMLPreformatted"/>
-        <w:rPr>
-          <w:rFonts w:ascii="ethiop" w:hAnsi="ethiop" w:cs="Abyssinica SIL"/>
-        </w:rPr>
-      </w:pPr>
-      <w:r>
-        <w:rPr>
-          <w:rFonts w:ascii="ethiop" w:hAnsi="ethiop" w:cs="Abyssinica SIL"/>
-        </w:rPr>
-        <w:t>14. ይመርር ᎀያትም ነግረግነት በ</w:t>
-      </w:r>
-      <w:r>
-        <w:rPr>
-          <w:rFonts w:ascii="ethiop" w:eastAsia="SunDotum" w:hAnsi="ethiop" w:cs="Abyssinica SIL"/>
-        </w:rPr>
-        <w:t>ⷕናኹ</w:t>
-      </w:r>
-      <w:r>
-        <w:rPr>
-          <w:rFonts w:ascii="ethiop" w:hAnsi="ethiop" w:cs="Abyssinica SIL"/>
-        </w:rPr>
-        <w:t xml:space="preserve"> ቢረብር</w:t>
-      </w:r>
-    </w:p>
-    <w:p>
-      <w:pPr>
-        <w:pStyle w:val="HTMLPreformatted"/>
-        <w:rPr>
-          <w:rFonts w:ascii="ethiop" w:hAnsi="ethiop" w:cs="Abyssinica SIL"/>
-        </w:rPr>
-      </w:pPr>
-      <w:r>
-        <w:rPr>
-          <w:rFonts w:ascii="ethiop" w:hAnsi="ethiop" w:cs="Abyssinica SIL"/>
-        </w:rPr>
-        <w:t>ኤያሟቅጥኹ፤ በውረም ቃር እንፈጠርኹ። 15. ዝኽ</w:t>
-      </w:r>
-    </w:p>
-    <w:p>
-      <w:pPr>
-        <w:pStyle w:val="HTMLPreformatted"/>
-        <w:rPr>
-          <w:rFonts w:ascii="ethiop" w:hAnsi="ethiop" w:cs="Abyssinica SIL"/>
-        </w:rPr>
-      </w:pPr>
-      <w:r>
-        <w:rPr>
-          <w:rFonts w:ascii="ethiop" w:hAnsi="ethiop" w:cs="Abyssinica SIL"/>
-        </w:rPr>
-        <w:t>ᎀያትም ነግረግነት ያነወ ኻሪነት ተአለም፥ ተምስየንዳም</w:t>
-      </w:r>
-    </w:p>
-    <w:p>
-      <w:pPr>
-        <w:pStyle w:val="HTMLPreformatted"/>
-        <w:rPr>
-          <w:rFonts w:ascii="ethiop" w:hAnsi="ethiop" w:cs="Abyssinica SIL"/>
-        </w:rPr>
-      </w:pPr>
-      <w:r>
-        <w:rPr>
-          <w:rFonts w:ascii="ethiop" w:hAnsi="ethiop" w:cs="Abyssinica SIL"/>
-        </w:rPr>
-        <w:t>ተሼጣኑ ባንኸሬ ተጔቴ አንኸረ። 16. ᎀያትም</w:t>
-      </w:r>
-    </w:p>
-    <w:p>
-      <w:pPr>
-        <w:pStyle w:val="HTMLPreformatted"/>
-        <w:rPr>
-          <w:rFonts w:ascii="ethiop" w:hAnsi="ethiop" w:cs="Abyssinica SIL"/>
-        </w:rPr>
-      </w:pPr>
-      <w:r>
-        <w:rPr>
-          <w:rFonts w:ascii="ethiop" w:hAnsi="ethiop" w:cs="Abyssinica SIL"/>
-        </w:rPr>
-        <w:t>ነግረግነት ባነቦᎌ መደር ኽያትም ᎃጥጥ ሜና እንም</w:t>
-      </w:r>
-    </w:p>
-    <w:p>
-      <w:pPr>
-        <w:pStyle w:val="HTMLPreformatted"/>
-        <w:rPr>
-          <w:rFonts w:ascii="ethiop" w:hAnsi="ethiop" w:cs="Abyssinica SIL"/>
-        </w:rPr>
-      </w:pPr>
-      <w:r>
-        <w:rPr>
-          <w:rFonts w:ascii="ethiop" w:hAnsi="ethiop" w:cs="Abyssinica SIL"/>
-        </w:rPr>
-        <w:t>ነረቦ። 17. ተጔቴ ይረኽዊ ኻሪነት ይፍትወረር</w:t>
-      </w:r>
-    </w:p>
-    <w:p>
-      <w:pPr>
-        <w:pStyle w:val="HTMLPreformatted"/>
-        <w:rPr>
-          <w:rFonts w:ascii="ethiop" w:hAnsi="ethiop" w:cs="Abyssinica SIL"/>
-        </w:rPr>
-      </w:pPr>
-      <w:r>
-        <w:rPr>
-          <w:rFonts w:ascii="ethiop" w:hAnsi="ethiop" w:cs="Abyssinica SIL"/>
-        </w:rPr>
-        <w:t>ንጡኹ። ተኽም አንᎀ ሻ᎖ቹ፥ ተራዜቡ ይታዘዝ፤</w:t>
-      </w:r>
-    </w:p>
-    <w:p>
-      <w:pPr>
-        <w:pStyle w:val="HTMLPreformatted"/>
-        <w:rPr>
-          <w:rFonts w:ascii="ethiop" w:hAnsi="ethiop" w:cs="Abyssinica SIL"/>
-        </w:rPr>
-      </w:pPr>
-      <w:r>
-        <w:rPr>
-          <w:rFonts w:ascii="ethiop" w:hAnsi="ethiop" w:cs="Abyssinica SIL"/>
-        </w:rPr>
-        <w:t>አትማጣጩ፥ ወኼ ወማ የሜናወው፥ ኤያደላ፥ ኸጥነት</w:t>
-      </w:r>
-    </w:p>
-    <w:p>
-      <w:pPr>
-        <w:pStyle w:val="HTMLPreformatted"/>
-        <w:rPr>
-          <w:rFonts w:ascii="ethiop" w:hAnsi="ethiop" w:cs="Abyssinica SIL"/>
-        </w:rPr>
-      </w:pPr>
-      <w:r>
-        <w:rPr>
-          <w:rFonts w:ascii="ethiop" w:hAnsi="ethiop" w:cs="Abyssinica SIL"/>
-        </w:rPr>
-        <w:t>ኤነወው። 18. ሽናት ይረምዶ ሰብ በሽናት ዘኖም</w:t>
-      </w:r>
-    </w:p>
-    <w:p>
-      <w:pPr>
-        <w:pStyle w:val="HTMLPreformatted"/>
-        <w:rPr>
-          <w:rFonts w:ascii="ethiop" w:hAnsi="ethiop" w:cs="Abyssinica SIL"/>
-        </w:rPr>
-      </w:pPr>
-      <w:r>
-        <w:rPr>
-          <w:rFonts w:ascii="ethiop" w:hAnsi="ethiop" w:cs="Abyssinica SIL"/>
-        </w:rPr>
         <w:t>ዩኼነት ወማ ይስበስቦ።</w:t>
       </w:r>
     </w:p>
@@ -22787,7 +22777,6 @@
         <w:rPr>
           <w:rFonts w:ascii="ethiop" w:hAnsi="ethiop" w:cs="Abyssinica SIL"/>
         </w:rPr>
-        <w:lastRenderedPageBreak/>
         <w:t xml:space="preserve">13. </w:t>
       </w:r>
       <w:r>
@@ -23087,6 +23076,7 @@
         <w:rPr>
           <w:rFonts w:ascii="ethiop" w:hAnsi="ethiop" w:cs="Abyssinica SIL"/>
         </w:rPr>
+        <w:lastRenderedPageBreak/>
         <w:t>ይቸንብኹ የኸሬ ኦኖም ብኾ። 2. ዋጋኹ እንም</w:t>
       </w:r>
     </w:p>
@@ -23727,7 +23717,6 @@
         <w:rPr>
           <w:rFonts w:ascii="ethiop" w:eastAsia="SunDotum" w:hAnsi="ethiop" w:cs="Abyssinica SIL"/>
         </w:rPr>
-        <w:lastRenderedPageBreak/>
         <w:t>ⷘታም</w:t>
       </w:r>
       <w:r>
@@ -25413,75 +25402,75 @@
         <w:rPr>
           <w:rFonts w:ascii="Cambria" w:hAnsi="Cambria" w:cs="Cambria"/>
         </w:rPr>
+        <w:t>«</w:t>
+      </w:r>
+      <w:r>
+        <w:rPr>
+          <w:rFonts w:ascii="ethiop" w:hAnsi="ethiop" w:cs="Abyssinica SIL"/>
+        </w:rPr>
+        <w:t>ኣገኪ እንዴ የጋንየ ፈረዝ ጫር በዪ</w:t>
+      </w:r>
+      <w:r>
+        <w:rPr>
+          <w:rFonts w:ascii="Cambria" w:hAnsi="Cambria" w:cs="Cambria"/>
+        </w:rPr>
+        <w:t>»</w:t>
+      </w:r>
+      <w:r>
+        <w:rPr>
+          <w:rFonts w:ascii="ethiop" w:hAnsi="ethiop" w:cs="Abyssinica SIL"/>
+        </w:rPr>
+        <w:t xml:space="preserve"> ባረናም ጋንየ ፈረዝ ጫረም ለጐመም ኣቈᎀንም፣ ኰርታዊ ይት𞟨ተን ሑጅር ባሳበታ ቲያትሜጥር አከሰም ታነ ያንቐ </w:t>
+      </w:r>
+      <w:r>
+        <w:rPr>
+          <w:rFonts w:ascii="Cambria" w:hAnsi="Cambria" w:cs="Cambria"/>
+        </w:rPr>
+        <w:t>«</w:t>
+      </w:r>
+      <w:r>
+        <w:rPr>
+          <w:rFonts w:ascii="ethiop" w:hAnsi="ethiop" w:cs="Abyssinica SIL"/>
+        </w:rPr>
+        <w:t>የዝ ይፍቴ ያናሸችን ሔጅር ተሐደሮት ኤነቢ፣ ኣንም ጋᎀ አዥን በሮትም ቁርጭን በሮቱ</w:t>
+      </w:r>
+      <w:r>
+        <w:rPr>
+          <w:rFonts w:ascii="Cambria" w:hAnsi="Cambria" w:cs="Cambria"/>
+        </w:rPr>
+        <w:t>»</w:t>
+      </w:r>
+      <w:r>
+        <w:rPr>
+          <w:rFonts w:ascii="ethiop" w:hAnsi="ethiop" w:cs="Abyssinica SIL"/>
+        </w:rPr>
+        <w:t xml:space="preserve"> ባረም ተገገታ ባትባታ ኣንቐ የጫሙቴ ቲያር ይፍት ከረ የት𞟨ተረን ሑጅረታ ተሐተረም። ግዝየም ናርበት ሳቴ ወረም።</w:t>
+      </w:r>
+    </w:p>
+    <w:p>
+      <w:pPr>
+        <w:rPr>
+          <w:rFonts w:ascii="ethiop" w:hAnsi="ethiop" w:cs="Abyssinica SIL"/>
+        </w:rPr>
+      </w:pPr>
+      <w:r>
+        <w:rPr>
+          <w:rFonts w:ascii="ethiop" w:hAnsi="ethiop" w:cs="Abyssinica SIL"/>
+        </w:rPr>
+        <w:t>ዛሕ ጫሙት ድየ ጋ በባረ ኣንቐ ኰርታዊ ያቴር ቃር ኣመሰረና የረፐሬ ቢያቴር ኣዠመነ ያቴረወ ሰብ ሐረችም ተጨነቀችም።</w:t>
+      </w:r>
+    </w:p>
+    <w:p>
+      <w:pPr>
+        <w:rPr>
+          <w:rFonts w:ascii="ethiop" w:hAnsi="ethiop" w:cs="Abyssinica SIL"/>
+        </w:rPr>
+      </w:pPr>
+      <w:r>
+        <w:rPr>
+          <w:rFonts w:ascii="ethiop" w:hAnsi="ethiop" w:cs="Abyssinica SIL"/>
+        </w:rPr>
         <w:lastRenderedPageBreak/>
-        <w:t>«</w:t>
-      </w:r>
-      <w:r>
-        <w:rPr>
-          <w:rFonts w:ascii="ethiop" w:hAnsi="ethiop" w:cs="Abyssinica SIL"/>
-        </w:rPr>
-        <w:t>ኣገኪ እንዴ የጋንየ ፈረዝ ጫር በዪ</w:t>
-      </w:r>
-      <w:r>
-        <w:rPr>
-          <w:rFonts w:ascii="Cambria" w:hAnsi="Cambria" w:cs="Cambria"/>
-        </w:rPr>
-        <w:t>»</w:t>
-      </w:r>
-      <w:r>
-        <w:rPr>
-          <w:rFonts w:ascii="ethiop" w:hAnsi="ethiop" w:cs="Abyssinica SIL"/>
-        </w:rPr>
-        <w:t xml:space="preserve"> ባረናም ጋንየ ፈረዝ ጫረም ለጐመም ኣቈᎀንም፣ ኰርታዊ ይት𞟨ተን ሑጅር ባሳበታ ቲያትሜጥር አከሰም ታነ ያንቐ </w:t>
-      </w:r>
-      <w:r>
-        <w:rPr>
-          <w:rFonts w:ascii="Cambria" w:hAnsi="Cambria" w:cs="Cambria"/>
-        </w:rPr>
-        <w:t>«</w:t>
-      </w:r>
-      <w:r>
-        <w:rPr>
-          <w:rFonts w:ascii="ethiop" w:hAnsi="ethiop" w:cs="Abyssinica SIL"/>
-        </w:rPr>
-        <w:t>የዝ ይፍቴ ያናሸችን ሔጅር ተሐደሮት ኤነቢ፣ ኣንም ጋᎀ አዥን በሮትም ቁርጭን በሮቱ</w:t>
-      </w:r>
-      <w:r>
-        <w:rPr>
-          <w:rFonts w:ascii="Cambria" w:hAnsi="Cambria" w:cs="Cambria"/>
-        </w:rPr>
-        <w:t>»</w:t>
-      </w:r>
-      <w:r>
-        <w:rPr>
-          <w:rFonts w:ascii="ethiop" w:hAnsi="ethiop" w:cs="Abyssinica SIL"/>
-        </w:rPr>
-        <w:t xml:space="preserve"> ባረም ተገገታ ባትባታ ኣንቐ የጫሙቴ ቲያር ይፍት ከረ የት𞟨ተረን ሑጅረታ ተሐተረም። ግዝየም ናርበት ሳቴ ወረም።</w:t>
-      </w:r>
-    </w:p>
-    <w:p>
-      <w:pPr>
-        <w:rPr>
-          <w:rFonts w:ascii="ethiop" w:hAnsi="ethiop" w:cs="Abyssinica SIL"/>
-        </w:rPr>
-      </w:pPr>
-      <w:r>
-        <w:rPr>
-          <w:rFonts w:ascii="ethiop" w:hAnsi="ethiop" w:cs="Abyssinica SIL"/>
-        </w:rPr>
-        <w:t>ዛሕ ጫሙት ድየ ጋ በባረ ኣንቐ ኰርታዊ ያቴር ቃር ኣመሰረና የረፐሬ ቢያቴር ኣዠመነ ያቴረወ ሰብ ሐረችም ተጨነቀችም።</w:t>
-      </w:r>
-    </w:p>
-    <w:p>
-      <w:pPr>
-        <w:rPr>
-          <w:rFonts w:ascii="ethiop" w:hAnsi="ethiop" w:cs="Abyssinica SIL"/>
-        </w:rPr>
-      </w:pPr>
-      <w:r>
-        <w:rPr>
-          <w:rFonts w:ascii="ethiop" w:hAnsi="ethiop" w:cs="Abyssinica SIL"/>
-        </w:rPr>
         <w:t>አሗ ድየ ትወጣ፣ ተዠፐረችም ትገባ፣ ኣዶት ወጣችም ታዥ፣ ኤ𞟨ሪሽ ሐማ ኤነ! ኣዶት ትትገባ ጫሙት ትወጣ፣ ኣቸ ምር ንበርሑ! ተጨነቁምሽ፣</w:t>
       </w:r>
     </w:p>

</xml_diff>